<commit_message>
Writ 2 - Submitted, but do check it again.
</commit_message>
<xml_diff>
--- a/assessment/writ2/DAT5001-TomRowan-ST20285213-Writ2.docx
+++ b/assessment/writ2/DAT5001-TomRowan-ST20285213-Writ2.docx
@@ -6,20 +6,14 @@
       <w:pPr>
         <w:pStyle w:val="Title"/>
         <w:rPr>
-          <w:rFonts w:ascii="Helvetica" w:hAnsi="Helvetica"/>
           <w:i/>
           <w:iCs/>
-          <w:sz w:val="44"/>
-          <w:szCs w:val="44"/>
         </w:rPr>
       </w:pPr>
       <w:r>
         <w:rPr>
-          <w:rFonts w:ascii="Helvetica" w:hAnsi="Helvetica"/>
           <w:i/>
           <w:iCs/>
-          <w:sz w:val="44"/>
-          <w:szCs w:val="44"/>
         </w:rPr>
         <w:t>Reflections on Creating</w:t>
       </w:r>
@@ -235,7 +229,7 @@
             </w:pPr>
             <w:bookmarkStart w:id="0" w:name="_Toc155876009"/>
             <w:bookmarkStart w:id="1" w:name="_Toc199754777"/>
-            <w:bookmarkStart w:id="2" w:name="_Toc215684311"/>
+            <w:bookmarkStart w:id="2" w:name="_Toc216033695"/>
             <w:r>
               <w:t>Course Details</w:t>
             </w:r>
@@ -254,9 +248,6 @@
               <w:tab/>
             </w:r>
             <w:r>
-              <w:rPr>
-                <w:color w:val="002060"/>
-              </w:rPr>
               <w:t>Data Visualisation</w:t>
             </w:r>
           </w:p>
@@ -271,9 +262,6 @@
               <w:tab/>
             </w:r>
             <w:r>
-              <w:rPr>
-                <w:color w:val="002060"/>
-              </w:rPr>
               <w:t>DAT5001 S2_25</w:t>
             </w:r>
           </w:p>
@@ -288,9 +276,6 @@
               <w:tab/>
             </w:r>
             <w:r>
-              <w:rPr>
-                <w:color w:val="002060"/>
-              </w:rPr>
               <w:t>Autumn 2025</w:t>
             </w:r>
           </w:p>
@@ -324,7 +309,7 @@
               <w:pStyle w:val="Heading1"/>
             </w:pPr>
             <w:bookmarkStart w:id="3" w:name="_Toc199754778"/>
-            <w:bookmarkStart w:id="4" w:name="_Toc215684312"/>
+            <w:bookmarkStart w:id="4" w:name="_Toc216033696"/>
             <w:r>
               <w:t>Student Details</w:t>
             </w:r>
@@ -332,21 +317,10 @@
             <w:bookmarkEnd w:id="4"/>
           </w:p>
           <w:p>
-            <w:pPr>
-              <w:rPr>
-                <w:color w:val="002060"/>
-              </w:rPr>
-            </w:pPr>
-            <w:r>
-              <w:rPr>
-                <w:color w:val="002060"/>
-              </w:rPr>
+            <w:r>
               <w:t xml:space="preserve">Tom Rowan </w:t>
             </w:r>
             <w:r>
-              <w:rPr>
-                <w:color w:val="002060"/>
-              </w:rPr>
               <w:tab/>
               <w:t xml:space="preserve">ST20285213 </w:t>
             </w:r>
@@ -358,7 +332,7 @@
             </w:pPr>
             <w:bookmarkStart w:id="5" w:name="_Toc155876011"/>
             <w:bookmarkStart w:id="6" w:name="_Toc199754779"/>
-            <w:bookmarkStart w:id="7" w:name="_Toc215684313"/>
+            <w:bookmarkStart w:id="7" w:name="_Toc216033697"/>
             <w:r>
               <w:t>Project Tutor</w:t>
             </w:r>
@@ -368,9 +342,6 @@
           </w:p>
           <w:p>
             <w:r>
-              <w:rPr>
-                <w:color w:val="002060"/>
-              </w:rPr>
               <w:t>Dr. Imtiaz Khan</w:t>
             </w:r>
           </w:p>
@@ -392,8 +363,6 @@
       <w:sdtPr>
         <w:rPr>
           <w:rFonts w:ascii="Liberation Serif" w:eastAsia="Noto Serif CJK SC" w:hAnsi="Liberation Serif"/>
-          <w:b w:val="0"/>
-          <w:bCs w:val="0"/>
           <w:sz w:val="24"/>
           <w:szCs w:val="24"/>
         </w:rPr>
@@ -406,6 +375,8 @@
       <w:sdtEndPr>
         <w:rPr>
           <w:rFonts w:ascii="Helvetica" w:hAnsi="Helvetica"/>
+          <w:b w:val="0"/>
+          <w:bCs w:val="0"/>
           <w:sz w:val="22"/>
           <w:szCs w:val="28"/>
         </w:rPr>
@@ -446,7 +417,7 @@
             </w:rPr>
             <w:fldChar w:fldCharType="separate"/>
           </w:r>
-          <w:hyperlink w:anchor="_Toc215684311" w:history="1">
+          <w:hyperlink w:anchor="_Toc216033695" w:history="1">
             <w:r>
               <w:rPr>
                 <w:rStyle w:val="Hyperlink"/>
@@ -470,7 +441,7 @@
               <w:rPr>
                 <w:noProof/>
               </w:rPr>
-              <w:instrText xml:space="preserve"> PAGEREF _Toc215684311 \h </w:instrText>
+              <w:instrText xml:space="preserve"> PAGEREF _Toc216033695 \h </w:instrText>
             </w:r>
             <w:r>
               <w:rPr>
@@ -509,7 +480,7 @@
               <w14:ligatures w14:val="standardContextual"/>
             </w:rPr>
           </w:pPr>
-          <w:hyperlink w:anchor="_Toc215684312" w:history="1">
+          <w:hyperlink w:anchor="_Toc216033696" w:history="1">
             <w:r>
               <w:rPr>
                 <w:rStyle w:val="Hyperlink"/>
@@ -533,7 +504,7 @@
               <w:rPr>
                 <w:noProof/>
               </w:rPr>
-              <w:instrText xml:space="preserve"> PAGEREF _Toc215684312 \h </w:instrText>
+              <w:instrText xml:space="preserve"> PAGEREF _Toc216033696 \h </w:instrText>
             </w:r>
             <w:r>
               <w:rPr>
@@ -572,7 +543,7 @@
               <w14:ligatures w14:val="standardContextual"/>
             </w:rPr>
           </w:pPr>
-          <w:hyperlink w:anchor="_Toc215684313" w:history="1">
+          <w:hyperlink w:anchor="_Toc216033697" w:history="1">
             <w:r>
               <w:rPr>
                 <w:rStyle w:val="Hyperlink"/>
@@ -596,7 +567,7 @@
               <w:rPr>
                 <w:noProof/>
               </w:rPr>
-              <w:instrText xml:space="preserve"> PAGEREF _Toc215684313 \h </w:instrText>
+              <w:instrText xml:space="preserve"> PAGEREF _Toc216033697 \h </w:instrText>
             </w:r>
             <w:r>
               <w:rPr>
@@ -625,7 +596,7 @@
         </w:p>
         <w:p>
           <w:pPr>
-            <w:pStyle w:val="TOC3"/>
+            <w:pStyle w:val="TOC1"/>
             <w:rPr>
               <w:rFonts w:asciiTheme="minorHAnsi" w:eastAsiaTheme="minorEastAsia" w:hAnsiTheme="minorHAnsi" w:cstheme="minorBidi"/>
               <w:noProof/>
@@ -635,13 +606,13 @@
               <w14:ligatures w14:val="standardContextual"/>
             </w:rPr>
           </w:pPr>
-          <w:hyperlink w:anchor="_Toc215684314" w:history="1">
+          <w:hyperlink w:anchor="_Toc216033698" w:history="1">
             <w:r>
               <w:rPr>
                 <w:rStyle w:val="Hyperlink"/>
                 <w:noProof/>
               </w:rPr>
-              <w:t>1. Introduction</w:t>
+              <w:t>Introduction</w:t>
             </w:r>
             <w:r>
               <w:rPr>
@@ -659,7 +630,7 @@
               <w:rPr>
                 <w:noProof/>
               </w:rPr>
-              <w:instrText xml:space="preserve"> PAGEREF _Toc215684314 \h </w:instrText>
+              <w:instrText xml:space="preserve"> PAGEREF _Toc216033698 \h </w:instrText>
             </w:r>
             <w:r>
               <w:rPr>
@@ -688,7 +659,7 @@
         </w:p>
         <w:p>
           <w:pPr>
-            <w:pStyle w:val="TOC3"/>
+            <w:pStyle w:val="TOC1"/>
             <w:rPr>
               <w:rFonts w:asciiTheme="minorHAnsi" w:eastAsiaTheme="minorEastAsia" w:hAnsiTheme="minorHAnsi" w:cstheme="minorBidi"/>
               <w:noProof/>
@@ -698,13 +669,13 @@
               <w14:ligatures w14:val="standardContextual"/>
             </w:rPr>
           </w:pPr>
-          <w:hyperlink w:anchor="_Toc215684315" w:history="1">
+          <w:hyperlink w:anchor="_Toc216033699" w:history="1">
             <w:r>
               <w:rPr>
                 <w:rStyle w:val="Hyperlink"/>
                 <w:noProof/>
               </w:rPr>
-              <w:t>2. Reflection on the Project</w:t>
+              <w:t>Reflection</w:t>
             </w:r>
             <w:r>
               <w:rPr>
@@ -722,7 +693,7 @@
               <w:rPr>
                 <w:noProof/>
               </w:rPr>
-              <w:instrText xml:space="preserve"> PAGEREF _Toc215684315 \h </w:instrText>
+              <w:instrText xml:space="preserve"> PAGEREF _Toc216033699 \h </w:instrText>
             </w:r>
             <w:r>
               <w:rPr>
@@ -739,7 +710,7 @@
               <w:rPr>
                 <w:noProof/>
               </w:rPr>
-              <w:t>3</w:t>
+              <w:t>4</w:t>
             </w:r>
             <w:r>
               <w:rPr>
@@ -751,7 +722,7 @@
         </w:p>
         <w:p>
           <w:pPr>
-            <w:pStyle w:val="TOC3"/>
+            <w:pStyle w:val="TOC2"/>
             <w:rPr>
               <w:rFonts w:asciiTheme="minorHAnsi" w:eastAsiaTheme="minorEastAsia" w:hAnsiTheme="minorHAnsi" w:cstheme="minorBidi"/>
               <w:noProof/>
@@ -761,13 +732,13 @@
               <w14:ligatures w14:val="standardContextual"/>
             </w:rPr>
           </w:pPr>
-          <w:hyperlink w:anchor="_Toc215684316" w:history="1">
+          <w:hyperlink w:anchor="_Toc216033700" w:history="1">
             <w:r>
               <w:rPr>
                 <w:rStyle w:val="Hyperlink"/>
                 <w:noProof/>
               </w:rPr>
-              <w:t>3. Skills and Personal Development</w:t>
+              <w:t>Activities</w:t>
             </w:r>
             <w:r>
               <w:rPr>
@@ -785,7 +756,7 @@
               <w:rPr>
                 <w:noProof/>
               </w:rPr>
-              <w:instrText xml:space="preserve"> PAGEREF _Toc215684316 \h </w:instrText>
+              <w:instrText xml:space="preserve"> PAGEREF _Toc216033700 \h </w:instrText>
             </w:r>
             <w:r>
               <w:rPr>
@@ -802,7 +773,7 @@
               <w:rPr>
                 <w:noProof/>
               </w:rPr>
-              <w:t>3</w:t>
+              <w:t>4</w:t>
             </w:r>
             <w:r>
               <w:rPr>
@@ -814,7 +785,7 @@
         </w:p>
         <w:p>
           <w:pPr>
-            <w:pStyle w:val="TOC3"/>
+            <w:pStyle w:val="TOC2"/>
             <w:rPr>
               <w:rFonts w:asciiTheme="minorHAnsi" w:eastAsiaTheme="minorEastAsia" w:hAnsiTheme="minorHAnsi" w:cstheme="minorBidi"/>
               <w:noProof/>
@@ -824,13 +795,14 @@
               <w14:ligatures w14:val="standardContextual"/>
             </w:rPr>
           </w:pPr>
-          <w:hyperlink w:anchor="_Toc215684317" w:history="1">
+          <w:hyperlink w:anchor="_Toc216033701" w:history="1">
             <w:r>
               <w:rPr>
                 <w:rStyle w:val="Hyperlink"/>
-                <w:noProof/>
-              </w:rPr>
-              <w:t>4. Strategies Undertaken</w:t>
+                <w:rFonts w:eastAsia="OpenSymbol"/>
+                <w:noProof/>
+              </w:rPr>
+              <w:t>Strengths</w:t>
             </w:r>
             <w:r>
               <w:rPr>
@@ -848,7 +820,7 @@
               <w:rPr>
                 <w:noProof/>
               </w:rPr>
-              <w:instrText xml:space="preserve"> PAGEREF _Toc215684317 \h </w:instrText>
+              <w:instrText xml:space="preserve"> PAGEREF _Toc216033701 \h </w:instrText>
             </w:r>
             <w:r>
               <w:rPr>
@@ -865,7 +837,7 @@
               <w:rPr>
                 <w:noProof/>
               </w:rPr>
-              <w:t>4</w:t>
+              <w:t>5</w:t>
             </w:r>
             <w:r>
               <w:rPr>
@@ -877,7 +849,7 @@
         </w:p>
         <w:p>
           <w:pPr>
-            <w:pStyle w:val="TOC3"/>
+            <w:pStyle w:val="TOC2"/>
             <w:rPr>
               <w:rFonts w:asciiTheme="minorHAnsi" w:eastAsiaTheme="minorEastAsia" w:hAnsiTheme="minorHAnsi" w:cstheme="minorBidi"/>
               <w:noProof/>
@@ -887,13 +859,14 @@
               <w14:ligatures w14:val="standardContextual"/>
             </w:rPr>
           </w:pPr>
-          <w:hyperlink w:anchor="_Toc215684318" w:history="1">
+          <w:hyperlink w:anchor="_Toc216033702" w:history="1">
             <w:r>
               <w:rPr>
                 <w:rStyle w:val="Hyperlink"/>
-                <w:noProof/>
-              </w:rPr>
-              <w:t>5. Looking Ahead</w:t>
+                <w:rFonts w:eastAsia="OpenSymbol"/>
+                <w:noProof/>
+              </w:rPr>
+              <w:t>Weaknesses</w:t>
             </w:r>
             <w:r>
               <w:rPr>
@@ -911,7 +884,7 @@
               <w:rPr>
                 <w:noProof/>
               </w:rPr>
-              <w:instrText xml:space="preserve"> PAGEREF _Toc215684318 \h </w:instrText>
+              <w:instrText xml:space="preserve"> PAGEREF _Toc216033702 \h </w:instrText>
             </w:r>
             <w:r>
               <w:rPr>
@@ -928,7 +901,197 @@
               <w:rPr>
                 <w:noProof/>
               </w:rPr>
-              <w:t>4</w:t>
+              <w:t>5</w:t>
+            </w:r>
+            <w:r>
+              <w:rPr>
+                <w:noProof/>
+              </w:rPr>
+              <w:fldChar w:fldCharType="end"/>
+            </w:r>
+          </w:hyperlink>
+        </w:p>
+        <w:p>
+          <w:pPr>
+            <w:pStyle w:val="TOC2"/>
+            <w:rPr>
+              <w:rFonts w:asciiTheme="minorHAnsi" w:eastAsiaTheme="minorEastAsia" w:hAnsiTheme="minorHAnsi" w:cstheme="minorBidi"/>
+              <w:noProof/>
+              <w:sz w:val="24"/>
+              <w:szCs w:val="24"/>
+              <w:lang w:eastAsia="en-GB" w:bidi="ar-SA"/>
+              <w14:ligatures w14:val="standardContextual"/>
+            </w:rPr>
+          </w:pPr>
+          <w:hyperlink w:anchor="_Toc216033703" w:history="1">
+            <w:r>
+              <w:rPr>
+                <w:rStyle w:val="Hyperlink"/>
+                <w:rFonts w:eastAsia="OpenSymbol"/>
+                <w:noProof/>
+              </w:rPr>
+              <w:t>Skills Gained</w:t>
+            </w:r>
+            <w:r>
+              <w:rPr>
+                <w:noProof/>
+              </w:rPr>
+              <w:tab/>
+            </w:r>
+            <w:r>
+              <w:rPr>
+                <w:noProof/>
+              </w:rPr>
+              <w:fldChar w:fldCharType="begin"/>
+            </w:r>
+            <w:r>
+              <w:rPr>
+                <w:noProof/>
+              </w:rPr>
+              <w:instrText xml:space="preserve"> PAGEREF _Toc216033703 \h </w:instrText>
+            </w:r>
+            <w:r>
+              <w:rPr>
+                <w:noProof/>
+              </w:rPr>
+            </w:r>
+            <w:r>
+              <w:rPr>
+                <w:noProof/>
+              </w:rPr>
+              <w:fldChar w:fldCharType="separate"/>
+            </w:r>
+            <w:r>
+              <w:rPr>
+                <w:noProof/>
+              </w:rPr>
+              <w:t>5</w:t>
+            </w:r>
+            <w:r>
+              <w:rPr>
+                <w:noProof/>
+              </w:rPr>
+              <w:fldChar w:fldCharType="end"/>
+            </w:r>
+          </w:hyperlink>
+        </w:p>
+        <w:p>
+          <w:pPr>
+            <w:pStyle w:val="TOC1"/>
+            <w:rPr>
+              <w:rFonts w:asciiTheme="minorHAnsi" w:eastAsiaTheme="minorEastAsia" w:hAnsiTheme="minorHAnsi" w:cstheme="minorBidi"/>
+              <w:noProof/>
+              <w:sz w:val="24"/>
+              <w:szCs w:val="24"/>
+              <w:lang w:eastAsia="en-GB" w:bidi="ar-SA"/>
+              <w14:ligatures w14:val="standardContextual"/>
+            </w:rPr>
+          </w:pPr>
+          <w:hyperlink w:anchor="_Toc216033704" w:history="1">
+            <w:r>
+              <w:rPr>
+                <w:rStyle w:val="Hyperlink"/>
+                <w:noProof/>
+              </w:rPr>
+              <w:t>Presentation</w:t>
+            </w:r>
+            <w:r>
+              <w:rPr>
+                <w:noProof/>
+              </w:rPr>
+              <w:tab/>
+            </w:r>
+            <w:r>
+              <w:rPr>
+                <w:noProof/>
+              </w:rPr>
+              <w:fldChar w:fldCharType="begin"/>
+            </w:r>
+            <w:r>
+              <w:rPr>
+                <w:noProof/>
+              </w:rPr>
+              <w:instrText xml:space="preserve"> PAGEREF _Toc216033704 \h </w:instrText>
+            </w:r>
+            <w:r>
+              <w:rPr>
+                <w:noProof/>
+              </w:rPr>
+            </w:r>
+            <w:r>
+              <w:rPr>
+                <w:noProof/>
+              </w:rPr>
+              <w:fldChar w:fldCharType="separate"/>
+            </w:r>
+            <w:r>
+              <w:rPr>
+                <w:noProof/>
+              </w:rPr>
+              <w:t>6</w:t>
+            </w:r>
+            <w:r>
+              <w:rPr>
+                <w:noProof/>
+              </w:rPr>
+              <w:fldChar w:fldCharType="end"/>
+            </w:r>
+          </w:hyperlink>
+        </w:p>
+        <w:p>
+          <w:pPr>
+            <w:pStyle w:val="TOC1"/>
+            <w:rPr>
+              <w:rFonts w:asciiTheme="minorHAnsi" w:eastAsiaTheme="minorEastAsia" w:hAnsiTheme="minorHAnsi" w:cstheme="minorBidi"/>
+              <w:noProof/>
+              <w:sz w:val="24"/>
+              <w:szCs w:val="24"/>
+              <w:lang w:eastAsia="en-GB" w:bidi="ar-SA"/>
+              <w14:ligatures w14:val="standardContextual"/>
+            </w:rPr>
+          </w:pPr>
+          <w:hyperlink w:anchor="_Toc216033705" w:history="1">
+            <w:r>
+              <w:rPr>
+                <w:rStyle w:val="Hyperlink"/>
+                <w:noProof/>
+              </w:rPr>
+              <w:t>Way Forward</w:t>
+            </w:r>
+            <w:r>
+              <w:rPr>
+                <w:noProof/>
+              </w:rPr>
+              <w:tab/>
+            </w:r>
+            <w:r>
+              <w:rPr>
+                <w:noProof/>
+              </w:rPr>
+              <w:fldChar w:fldCharType="begin"/>
+            </w:r>
+            <w:r>
+              <w:rPr>
+                <w:noProof/>
+              </w:rPr>
+              <w:instrText xml:space="preserve"> PAGEREF _Toc216033705 \h </w:instrText>
+            </w:r>
+            <w:r>
+              <w:rPr>
+                <w:noProof/>
+              </w:rPr>
+            </w:r>
+            <w:r>
+              <w:rPr>
+                <w:noProof/>
+              </w:rPr>
+              <w:fldChar w:fldCharType="separate"/>
+            </w:r>
+            <w:r>
+              <w:rPr>
+                <w:noProof/>
+              </w:rPr>
+              <w:t>7</w:t>
             </w:r>
             <w:r>
               <w:rPr>
@@ -961,337 +1124,418 @@
     </w:p>
     <w:p>
       <w:pPr>
-        <w:pStyle w:val="Heading3"/>
-        <w:rPr>
-          <w:rFonts w:ascii="Times New Roman" w:hAnsi="Times New Roman"/>
-          <w:sz w:val="27"/>
-          <w:szCs w:val="27"/>
-        </w:rPr>
-      </w:pPr>
-      <w:bookmarkStart w:id="8" w:name="_Toc215684314"/>
-      <w:r>
-        <w:lastRenderedPageBreak/>
-        <w:t xml:space="preserve">1. </w:t>
-      </w:r>
-      <w:r>
+        <w:pStyle w:val="Heading1"/>
         <w:rPr>
           <w:rStyle w:val="Strong"/>
           <w:b/>
           <w:bCs/>
         </w:rPr>
-        <w:t>Introduction</w:t>
-      </w:r>
-      <w:bookmarkEnd w:id="8"/>
-    </w:p>
-    <w:p>
-      <w:pPr>
-        <w:pStyle w:val="NormalWeb"/>
-        <w:numPr>
-          <w:ilvl w:val="0"/>
-          <w:numId w:val="12"/>
-        </w:numPr>
-      </w:pPr>
-      <w:r>
-        <w:t xml:space="preserve">Briefly outline the project: </w:t>
-      </w:r>
-      <w:r>
-        <w:rPr>
-          <w:rStyle w:val="Emphasis"/>
-        </w:rPr>
-        <w:t>Example</w:t>
-      </w:r>
-      <w:r>
-        <w:t>: “This project involved collecting, cleaning, and analysing satellite and space debris datasets to explore the risks posed by orbital congestion.”</w:t>
-      </w:r>
-    </w:p>
-    <w:p>
-      <w:pPr>
-        <w:pStyle w:val="NormalWeb"/>
-        <w:numPr>
-          <w:ilvl w:val="0"/>
-          <w:numId w:val="12"/>
-        </w:numPr>
-      </w:pPr>
-      <w:r>
-        <w:t xml:space="preserve">Mention the context: academic setting, individual work, tools used (Python, </w:t>
-      </w:r>
-      <w:proofErr w:type="spellStart"/>
-      <w:r>
-        <w:t>Jupyter</w:t>
-      </w:r>
-      <w:proofErr w:type="spellEnd"/>
-      <w:r>
-        <w:t>, data visualisation libraries).</w:t>
-      </w:r>
-    </w:p>
-    <w:p>
-      <w:pPr>
-        <w:pStyle w:val="NormalWeb"/>
-        <w:numPr>
-          <w:ilvl w:val="0"/>
-          <w:numId w:val="12"/>
-        </w:numPr>
-      </w:pPr>
-      <w:r>
-        <w:t>State the purpose of the reflection: to evaluate your experience, skills, and learning.</w:t>
-      </w:r>
-    </w:p>
-    <w:p>
-      <w:pPr>
-        <w:pStyle w:val="Heading3"/>
-      </w:pPr>
-      <w:bookmarkStart w:id="9" w:name="_Toc215684315"/>
-      <w:r>
-        <w:t xml:space="preserve">2. </w:t>
-      </w:r>
+      </w:pPr>
+      <w:bookmarkStart w:id="8" w:name="_Toc216033698"/>
       <w:r>
         <w:rPr>
           <w:rStyle w:val="Strong"/>
           <w:b/>
           <w:bCs/>
         </w:rPr>
-        <w:t>Reflection on the Project</w:t>
-      </w:r>
-      <w:bookmarkEnd w:id="9"/>
-    </w:p>
-    <w:p>
-      <w:pPr>
-        <w:pStyle w:val="NormalWeb"/>
-      </w:pPr>
-      <w:r>
-        <w:t>Use the cycle prompts to structure your thoughts:</w:t>
-      </w:r>
-    </w:p>
-    <w:p>
-      <w:pPr>
-        <w:pStyle w:val="NormalWeb"/>
-        <w:numPr>
-          <w:ilvl w:val="0"/>
-          <w:numId w:val="13"/>
-        </w:numPr>
-      </w:pPr>
-      <w:r>
+        <w:lastRenderedPageBreak/>
+        <w:t>Introduction</w:t>
+      </w:r>
+      <w:bookmarkEnd w:id="8"/>
+    </w:p>
+    <w:p>
+      <w:r>
+        <w:t>This project involved collecting, cleaning, and analysing satellite and space debris datasets to explore the risks posed by orbital congestion</w:t>
+      </w:r>
+      <w:r>
+        <w:t xml:space="preserve">, and </w:t>
+      </w:r>
+      <w:r>
+        <w:t>the creation of visualisations, and presentation design.</w:t>
+      </w:r>
+      <w:r>
+        <w:t xml:space="preserve"> </w:t>
+      </w:r>
+      <w:r>
+        <w:t>The report</w:t>
+      </w:r>
+      <w:r>
+        <w:t xml:space="preserve"> and related presentation </w:t>
+      </w:r>
+      <w:r>
+        <w:t>aim</w:t>
+      </w:r>
+      <w:r>
+        <w:t xml:space="preserve"> </w:t>
+      </w:r>
+      <w:r>
+        <w:t>to describe the Kessler Syndrome</w:t>
+      </w:r>
+      <w:r>
+        <w:t xml:space="preserve">, </w:t>
+      </w:r>
+      <w:r>
+        <w:t xml:space="preserve">to explore what is in orbit, who put it there and how long it lasts. </w:t>
+      </w:r>
+    </w:p>
+    <w:p>
+      <w:r>
+        <w:t>I feel that I have met the learning objective</w:t>
+      </w:r>
+      <w:r>
+        <w:t>s</w:t>
+      </w:r>
+      <w:r>
+        <w:t xml:space="preserve"> of this module, as this reflection report will attest. </w:t>
+      </w:r>
+    </w:p>
+    <w:p>
+      <w:r>
+        <w:t xml:space="preserve">I used </w:t>
+      </w:r>
+      <w:r>
+        <w:t xml:space="preserve">standard </w:t>
+      </w:r>
+      <w:r>
+        <w:t>data cleaning and analysis techniques to produce a working dataset</w:t>
+      </w:r>
+      <w:r>
+        <w:t xml:space="preserve">. </w:t>
+      </w:r>
+      <w:r>
+        <w:t xml:space="preserve">I used </w:t>
+      </w:r>
+      <w:r>
+        <w:t>p</w:t>
+      </w:r>
+      <w:r>
+        <w:t xml:space="preserve">ython in </w:t>
+      </w:r>
+      <w:proofErr w:type="spellStart"/>
+      <w:r>
+        <w:t>Jupyter</w:t>
+      </w:r>
+      <w:proofErr w:type="spellEnd"/>
+      <w:r>
+        <w:t xml:space="preserve"> notebooks </w:t>
+      </w:r>
+      <w:r>
+        <w:t xml:space="preserve">to </w:t>
+      </w:r>
+      <w:r>
+        <w:t>analyse and visualise this data.</w:t>
+      </w:r>
+      <w:r>
+        <w:t xml:space="preserve"> I created numerous charts and maps using a variety of visualisation libraries. </w:t>
+      </w:r>
+    </w:p>
+    <w:p>
+      <w:r>
+        <w:t xml:space="preserve">The charts were designed to display the data in an engaging </w:t>
+      </w:r>
+      <w:r>
+        <w:t xml:space="preserve">way. The choice of type was led by the structure of the data being displayed, as well as the focus of the message being conveyed. </w:t>
+      </w:r>
+    </w:p>
+    <w:p>
+      <w:r>
+        <w:t xml:space="preserve">In this reflection on the project, I will evaluate the experience of creating the report and presentation. I will discuss the skills I have earned, and the learning that I have done. </w:t>
+      </w:r>
+    </w:p>
+    <w:p/>
+    <w:p/>
+    <w:p>
+      <w:pPr>
+        <w:spacing w:after="0"/>
+        <w:jc w:val="left"/>
         <w:rPr>
           <w:rStyle w:val="Strong"/>
-          <w:rFonts w:eastAsia="OpenSymbol"/>
+          <w:rFonts w:eastAsia="Noto Sans CJK SC"/>
+          <w:sz w:val="36"/>
+          <w:szCs w:val="36"/>
         </w:rPr>
-        <w:t>What was the project?</w:t>
-      </w:r>
-      <w:r>
-        <w:t xml:space="preserve"> Data collection and analysis of satellite datasets, creation of visualisations, and presentation design.</w:t>
-      </w:r>
-    </w:p>
-    <w:p>
-      <w:pPr>
-        <w:pStyle w:val="NormalWeb"/>
-        <w:numPr>
-          <w:ilvl w:val="0"/>
-          <w:numId w:val="13"/>
-        </w:numPr>
       </w:pPr>
       <w:r>
         <w:rPr>
           <w:rStyle w:val="Strong"/>
-          <w:rFonts w:eastAsia="OpenSymbol"/>
+          <w:b w:val="0"/>
+          <w:bCs w:val="0"/>
         </w:rPr>
-        <w:t>Who was involved?</w:t>
-      </w:r>
-      <w:r>
-        <w:t xml:space="preserve"> Primarily yourself, but you relied on external datasets (McDowell, UCS, N2YO) and documentation.</w:t>
-      </w:r>
-    </w:p>
-    <w:p>
-      <w:pPr>
-        <w:pStyle w:val="NormalWeb"/>
-        <w:numPr>
-          <w:ilvl w:val="0"/>
-          <w:numId w:val="13"/>
-        </w:numPr>
-      </w:pPr>
-      <w:r>
-        <w:rPr>
-          <w:rStyle w:val="Strong"/>
-          <w:rFonts w:eastAsia="OpenSymbol"/>
-        </w:rPr>
-        <w:t>Where did it happen?</w:t>
-      </w:r>
-      <w:r>
-        <w:t xml:space="preserve"> Conducted on your own system (Linux, </w:t>
-      </w:r>
-      <w:proofErr w:type="spellStart"/>
-      <w:r>
-        <w:t>VSCode</w:t>
-      </w:r>
-      <w:proofErr w:type="spellEnd"/>
-      <w:r>
-        <w:t xml:space="preserve">, </w:t>
-      </w:r>
-      <w:proofErr w:type="spellStart"/>
-      <w:r>
-        <w:t>Jupyter</w:t>
-      </w:r>
-      <w:proofErr w:type="spellEnd"/>
-      <w:r>
-        <w:t xml:space="preserve"> notebooks), with online resources.</w:t>
-      </w:r>
-    </w:p>
-    <w:p>
-      <w:pPr>
-        <w:pStyle w:val="NormalWeb"/>
-        <w:numPr>
-          <w:ilvl w:val="0"/>
-          <w:numId w:val="13"/>
-        </w:numPr>
-      </w:pPr>
-      <w:r>
-        <w:rPr>
-          <w:rStyle w:val="Strong"/>
-          <w:rFonts w:eastAsia="OpenSymbol"/>
-        </w:rPr>
-        <w:t>What occurred?</w:t>
-      </w:r>
-      <w:r>
-        <w:t xml:space="preserve"> Challenges in finding reliable datasets, ethical considerations around scraping, cleaning inconsistent data, feature engineering, and designing effective visualisations.</w:t>
-      </w:r>
-    </w:p>
-    <w:p>
-      <w:pPr>
-        <w:pStyle w:val="NormalWeb"/>
-        <w:numPr>
-          <w:ilvl w:val="0"/>
-          <w:numId w:val="13"/>
-        </w:numPr>
-      </w:pPr>
-      <w:r>
-        <w:rPr>
-          <w:rStyle w:val="Strong"/>
-          <w:rFonts w:eastAsia="OpenSymbol"/>
-        </w:rPr>
-        <w:t>How did you feel?</w:t>
-      </w:r>
-    </w:p>
-    <w:p>
-      <w:pPr>
-        <w:pStyle w:val="NormalWeb"/>
-        <w:numPr>
-          <w:ilvl w:val="1"/>
-          <w:numId w:val="13"/>
-        </w:numPr>
-      </w:pPr>
-      <w:r>
-        <w:t>At the start: perhaps overwhelmed by the lack of accessible datasets.</w:t>
-      </w:r>
-    </w:p>
-    <w:p>
-      <w:pPr>
-        <w:pStyle w:val="NormalWeb"/>
-        <w:numPr>
-          <w:ilvl w:val="1"/>
-          <w:numId w:val="13"/>
-        </w:numPr>
-      </w:pPr>
-      <w:r>
-        <w:t>During: satisfaction when finding McDowell’s dataset; frustration with cleaning inconsistent dates; pride in creating meaningful charts.</w:t>
-      </w:r>
-    </w:p>
-    <w:p>
-      <w:pPr>
-        <w:pStyle w:val="NormalWeb"/>
-        <w:numPr>
-          <w:ilvl w:val="1"/>
-          <w:numId w:val="13"/>
-        </w:numPr>
-      </w:pPr>
-      <w:r>
-        <w:t>After: accomplishment in producing a coherent dataset and presentation.</w:t>
-      </w:r>
-    </w:p>
-    <w:p>
-      <w:pPr>
-        <w:pStyle w:val="NormalWeb"/>
-        <w:numPr>
-          <w:ilvl w:val="0"/>
-          <w:numId w:val="13"/>
-        </w:numPr>
-      </w:pPr>
-      <w:r>
-        <w:rPr>
-          <w:rStyle w:val="Strong"/>
-          <w:rFonts w:eastAsia="OpenSymbol"/>
-        </w:rPr>
-        <w:t>Could things have been done differently?</w:t>
-      </w:r>
-    </w:p>
-    <w:p>
-      <w:pPr>
-        <w:pStyle w:val="NormalWeb"/>
-        <w:numPr>
-          <w:ilvl w:val="1"/>
-          <w:numId w:val="13"/>
-        </w:numPr>
-      </w:pPr>
-      <w:r>
-        <w:t>Maybe earlier exploration of academic datasets to save time.</w:t>
-      </w:r>
-    </w:p>
-    <w:p>
-      <w:pPr>
-        <w:pStyle w:val="NormalWeb"/>
-        <w:numPr>
-          <w:ilvl w:val="1"/>
-          <w:numId w:val="13"/>
-        </w:numPr>
-      </w:pPr>
-      <w:r>
-        <w:t>Automating some cleaning steps more efficiently.</w:t>
-      </w:r>
-    </w:p>
-    <w:p>
-      <w:pPr>
-        <w:pStyle w:val="NormalWeb"/>
-        <w:numPr>
-          <w:ilvl w:val="1"/>
-          <w:numId w:val="13"/>
-        </w:numPr>
-      </w:pPr>
-      <w:r>
-        <w:t>Considering collaboration or reaching out to dataset maintainers for guidance.</w:t>
-      </w:r>
-    </w:p>
-    <w:p>
-      <w:pPr>
-        <w:pStyle w:val="Heading3"/>
-      </w:pPr>
-      <w:bookmarkStart w:id="10" w:name="_Toc215684316"/>
-      <w:r>
-        <w:t xml:space="preserve">3. </w:t>
-      </w:r>
+        <w:br w:type="page"/>
+      </w:r>
+    </w:p>
+    <w:p>
+      <w:pPr>
+        <w:pStyle w:val="Heading1"/>
+      </w:pPr>
+      <w:bookmarkStart w:id="9" w:name="_Toc216033699"/>
       <w:r>
         <w:rPr>
           <w:rStyle w:val="Strong"/>
           <w:b/>
           <w:bCs/>
         </w:rPr>
-        <w:t>Skills and Personal Development</w:t>
+        <w:lastRenderedPageBreak/>
+        <w:t>Reflection</w:t>
+      </w:r>
+      <w:bookmarkEnd w:id="9"/>
+    </w:p>
+    <w:p>
+      <w:r>
+        <w:t>I believe that I chose a timely and relevant topic and created a presentation that explores it in an engaging and interesting manner.</w:t>
+      </w:r>
+    </w:p>
+    <w:p>
+      <w:pPr>
+        <w:pStyle w:val="Heading2"/>
+      </w:pPr>
+      <w:bookmarkStart w:id="10" w:name="_Toc216033700"/>
+      <w:r>
+        <w:t>Activities</w:t>
       </w:r>
       <w:bookmarkEnd w:id="10"/>
     </w:p>
     <w:p>
-      <w:pPr>
-        <w:pStyle w:val="NormalWeb"/>
-      </w:pPr>
-      <w:r>
-        <w:t>Reflect on strengths and weaknesses:</w:t>
-      </w:r>
-    </w:p>
-    <w:p>
-      <w:pPr>
-        <w:pStyle w:val="NormalWeb"/>
-        <w:numPr>
-          <w:ilvl w:val="0"/>
-          <w:numId w:val="14"/>
-        </w:numPr>
-      </w:pPr>
+      <w:r>
+        <w:t xml:space="preserve">Although I am interested in space exploration, technology and science, I was not initially familiar with all the terms being used in discussions around the subject. I </w:t>
+      </w:r>
+      <w:r>
+        <w:t xml:space="preserve">spent some time early in the project timeframe reading to research domain knowledge. </w:t>
+      </w:r>
+    </w:p>
+    <w:p>
+      <w:r>
+        <w:t xml:space="preserve">It was more challenging than expected to find </w:t>
+      </w:r>
+      <w:r>
+        <w:t xml:space="preserve">suitable </w:t>
+      </w:r>
+      <w:r>
+        <w:t xml:space="preserve">data; </w:t>
+      </w:r>
+      <w:r>
+        <w:t>I obtained and explored several datasets</w:t>
+      </w:r>
+      <w:r>
+        <w:t xml:space="preserve"> before finding an up to date and complete dataset. </w:t>
+      </w:r>
+      <w:r>
+        <w:t xml:space="preserve">On one occasion, I opted to avoid scraping a </w:t>
+      </w:r>
+      <w:r>
+        <w:t>complete dataset</w:t>
+      </w:r>
+      <w:r>
+        <w:t xml:space="preserve"> from a non-commercial website due to ethical concerns about the bandwidth and processing costs involved. </w:t>
+      </w:r>
+    </w:p>
+    <w:p>
+      <w:r>
+        <w:t>If undertaking this project again, I would have started exploration of the available datasets earlier. Once I found a suitable dataset, work progressed quickly.</w:t>
+      </w:r>
+    </w:p>
+    <w:p>
+      <w:r>
+        <w:t xml:space="preserve">The dataset I </w:t>
+      </w:r>
+      <w:r>
+        <w:t xml:space="preserve">finally </w:t>
+      </w:r>
+      <w:r>
+        <w:t>used came with extensive documentation which I</w:t>
+      </w:r>
+      <w:r>
+        <w:t xml:space="preserve"> needed to</w:t>
+      </w:r>
+      <w:r>
+        <w:t xml:space="preserve"> use</w:t>
+      </w:r>
+      <w:r>
+        <w:t xml:space="preserve"> to</w:t>
+      </w:r>
+      <w:r>
+        <w:t xml:space="preserve"> interpret the codes used in various categorial data fields.</w:t>
+      </w:r>
+      <w:r>
+        <w:t xml:space="preserve"> I replaced these codes with descriptive text to aid understanding.</w:t>
+      </w:r>
+    </w:p>
+    <w:p>
+      <w:r>
+        <w:rPr>
+          <w:rStyle w:val="Strong"/>
+          <w:rFonts w:eastAsia="OpenSymbol"/>
+          <w:b w:val="0"/>
+          <w:bCs w:val="0"/>
+        </w:rPr>
+        <w:t xml:space="preserve">The data </w:t>
+      </w:r>
+      <w:r>
+        <w:rPr>
+          <w:rStyle w:val="Strong"/>
+          <w:rFonts w:eastAsia="OpenSymbol"/>
+          <w:b w:val="0"/>
+          <w:bCs w:val="0"/>
+        </w:rPr>
+        <w:t>exploration</w:t>
+      </w:r>
+      <w:r>
+        <w:rPr>
+          <w:rStyle w:val="Strong"/>
+          <w:rFonts w:eastAsia="OpenSymbol"/>
+          <w:b w:val="0"/>
+          <w:bCs w:val="0"/>
+        </w:rPr>
+        <w:t xml:space="preserve">, cleaning, feature engineering and visualisation was </w:t>
+      </w:r>
+      <w:r>
+        <w:t>c</w:t>
+      </w:r>
+      <w:r>
+        <w:t>onducted on</w:t>
+      </w:r>
+      <w:r>
+        <w:t xml:space="preserve"> </w:t>
+      </w:r>
+      <w:r>
+        <w:t>Linux</w:t>
+      </w:r>
+      <w:r>
+        <w:t xml:space="preserve"> </w:t>
+      </w:r>
+      <w:r>
+        <w:t xml:space="preserve">and MacOS </w:t>
+      </w:r>
+      <w:r>
+        <w:t>system</w:t>
+      </w:r>
+      <w:r>
+        <w:t>s</w:t>
+      </w:r>
+      <w:r>
+        <w:t xml:space="preserve"> using </w:t>
+      </w:r>
+      <w:proofErr w:type="spellStart"/>
+      <w:r>
+        <w:t>VSCode</w:t>
+      </w:r>
+      <w:proofErr w:type="spellEnd"/>
+      <w:r>
+        <w:t xml:space="preserve"> and</w:t>
+      </w:r>
+      <w:r>
+        <w:t xml:space="preserve"> </w:t>
+      </w:r>
+      <w:proofErr w:type="spellStart"/>
+      <w:r>
+        <w:t>Jupyter</w:t>
+      </w:r>
+      <w:proofErr w:type="spellEnd"/>
+      <w:r>
+        <w:t xml:space="preserve"> notebooks</w:t>
+      </w:r>
+      <w:r>
+        <w:t>.</w:t>
+      </w:r>
+      <w:r>
+        <w:t xml:space="preserve"> </w:t>
+      </w:r>
+      <w:r>
+        <w:t xml:space="preserve">Charts were saved as PNG files. </w:t>
+      </w:r>
+      <w:r>
+        <w:t xml:space="preserve">GitHub was used for </w:t>
+      </w:r>
+      <w:r>
+        <w:t xml:space="preserve">multi-system </w:t>
+      </w:r>
+      <w:r>
+        <w:t xml:space="preserve">version control. </w:t>
+      </w:r>
+      <w:r>
+        <w:t xml:space="preserve">The final presentation was assembled on a MacBook using Microsoft PowerPoint. This was a flexible and productive way for me to work, allowing me to make the best use of the equipment I have available. </w:t>
+      </w:r>
+    </w:p>
+    <w:p>
+      <w:r>
+        <w:t>I used a combination or horizontal and vertical bar charts, choosing the type depending on the number of categories being compared. I found coloured bubble charts helpful to show categorical data over time.</w:t>
+      </w:r>
+    </w:p>
+    <w:p>
+      <w:r>
+        <w:t xml:space="preserve">I learned some new techniques when working with fine detail in creating graphs in Matplotlib. For example, I used controls to influence the relative positioning of the chart data, text labels and axes. I learned how to use HTML-like coding to adjust text styles, and how to combine data from different series into text labels. This was the only time in the entire project that I used AI; I tend to use it like </w:t>
+      </w:r>
+      <w:r>
+        <w:t xml:space="preserve">an ‘extended Google’ resource. </w:t>
+      </w:r>
+    </w:p>
+    <w:p>
+      <w:r>
+        <w:t xml:space="preserve">I split the data engineering and visualisation tasks into two </w:t>
+      </w:r>
+      <w:proofErr w:type="spellStart"/>
+      <w:r>
+        <w:t>Jupyter</w:t>
+      </w:r>
+      <w:proofErr w:type="spellEnd"/>
+      <w:r>
+        <w:t xml:space="preserve"> notebooks. I could have finalised all the data cleaning and feature engineering steps earlier in the project timeline. Then I would have been able to focus </w:t>
+      </w:r>
+      <w:r>
+        <w:t xml:space="preserve">more time </w:t>
+      </w:r>
+      <w:r>
+        <w:t>on producing charts. I found myself going back to the data engineering notebook to make changes quite late into the project. I should also have created multiple smaller visualisation notebooks to save processing time.</w:t>
+      </w:r>
+    </w:p>
+    <w:p>
+      <w:pPr>
+        <w:rPr>
+          <w:b/>
+          <w:bCs/>
+        </w:rPr>
+      </w:pPr>
+      <w:r>
+        <w:t xml:space="preserve">Overall, </w:t>
+      </w:r>
+      <w:r>
+        <w:t xml:space="preserve">I feel that I have developed as a data scientist through this project; it has been a valuable exercise. </w:t>
+      </w:r>
+      <w:r>
+        <w:t>I found the class discussions useful, especially the workshops around time series and the analysis of geo-</w:t>
+      </w:r>
+      <w:proofErr w:type="spellStart"/>
+      <w:r>
+        <w:t>spacial</w:t>
+      </w:r>
+      <w:proofErr w:type="spellEnd"/>
+      <w:r>
+        <w:t xml:space="preserve"> data.</w:t>
+      </w:r>
+      <w:r>
+        <w:t xml:space="preserve"> </w:t>
+      </w:r>
+    </w:p>
+    <w:p>
+      <w:pPr>
+        <w:spacing w:after="0"/>
+        <w:jc w:val="left"/>
+      </w:pPr>
+      <w:r>
+        <w:br w:type="page"/>
+      </w:r>
+    </w:p>
+    <w:p>
+      <w:r>
+        <w:lastRenderedPageBreak/>
+        <w:t>To summarise the above:</w:t>
+      </w:r>
+    </w:p>
+    <w:p>
+      <w:pPr>
+        <w:pStyle w:val="Heading2"/>
+      </w:pPr>
+      <w:bookmarkStart w:id="11" w:name="_Toc216033701"/>
       <w:r>
         <w:rPr>
           <w:rStyle w:val="Strong"/>
@@ -1299,63 +1543,126 @@
         </w:rPr>
         <w:t>Strengths</w:t>
       </w:r>
-    </w:p>
-    <w:p>
-      <w:pPr>
-        <w:pStyle w:val="NormalWeb"/>
-        <w:numPr>
-          <w:ilvl w:val="1"/>
-          <w:numId w:val="14"/>
-        </w:numPr>
-      </w:pPr>
-      <w:r>
-        <w:t>Persistence in overcoming dataset challenges.</w:t>
-      </w:r>
-    </w:p>
-    <w:p>
-      <w:pPr>
-        <w:pStyle w:val="NormalWeb"/>
-        <w:numPr>
-          <w:ilvl w:val="1"/>
-          <w:numId w:val="14"/>
-        </w:numPr>
-      </w:pPr>
-      <w:r>
-        <w:t>Technical skills in Python, pandas, and visualisation libraries.</w:t>
-      </w:r>
-    </w:p>
-    <w:p>
-      <w:pPr>
-        <w:pStyle w:val="NormalWeb"/>
-        <w:numPr>
-          <w:ilvl w:val="1"/>
-          <w:numId w:val="14"/>
-        </w:numPr>
-      </w:pPr>
-      <w:r>
-        <w:t>Ethical awareness (avoiding scraping N2YO excessively).</w:t>
-      </w:r>
-    </w:p>
-    <w:p>
-      <w:pPr>
-        <w:pStyle w:val="NormalWeb"/>
-        <w:numPr>
-          <w:ilvl w:val="1"/>
-          <w:numId w:val="14"/>
-        </w:numPr>
-      </w:pPr>
-      <w:r>
-        <w:t>Creativity in palette and chart design.</w:t>
-      </w:r>
-    </w:p>
-    <w:p>
-      <w:pPr>
-        <w:pStyle w:val="NormalWeb"/>
+      <w:bookmarkEnd w:id="11"/>
+    </w:p>
+    <w:p>
+      <w:pPr>
+        <w:pStyle w:val="ListParagraph"/>
         <w:numPr>
           <w:ilvl w:val="0"/>
-          <w:numId w:val="14"/>
+          <w:numId w:val="18"/>
         </w:numPr>
       </w:pPr>
+      <w:r>
+        <w:t>Ability to research a topic to gain domain knowledge.</w:t>
+      </w:r>
+    </w:p>
+    <w:p>
+      <w:pPr>
+        <w:pStyle w:val="ListParagraph"/>
+        <w:numPr>
+          <w:ilvl w:val="0"/>
+          <w:numId w:val="18"/>
+        </w:numPr>
+      </w:pPr>
+      <w:r>
+        <w:t xml:space="preserve">Persistence in overcoming dataset </w:t>
+      </w:r>
+      <w:r>
+        <w:t xml:space="preserve">availability </w:t>
+      </w:r>
+      <w:r>
+        <w:t>challenges.</w:t>
+      </w:r>
+    </w:p>
+    <w:p>
+      <w:pPr>
+        <w:pStyle w:val="ListParagraph"/>
+        <w:numPr>
+          <w:ilvl w:val="0"/>
+          <w:numId w:val="18"/>
+        </w:numPr>
+      </w:pPr>
+      <w:r>
+        <w:t>Technical skills in Python, pandas</w:t>
+      </w:r>
+      <w:r>
+        <w:t>,</w:t>
+      </w:r>
+      <w:r>
+        <w:t xml:space="preserve"> visualisation libraries</w:t>
+      </w:r>
+      <w:r>
+        <w:t xml:space="preserve">, </w:t>
+      </w:r>
+      <w:r>
+        <w:t xml:space="preserve">and </w:t>
+      </w:r>
+      <w:r>
+        <w:t>PowerPoint</w:t>
+      </w:r>
+      <w:r>
+        <w:t>.</w:t>
+      </w:r>
+    </w:p>
+    <w:p>
+      <w:pPr>
+        <w:pStyle w:val="ListParagraph"/>
+        <w:numPr>
+          <w:ilvl w:val="0"/>
+          <w:numId w:val="18"/>
+        </w:numPr>
+      </w:pPr>
+      <w:r>
+        <w:t>Showed e</w:t>
+      </w:r>
+      <w:r>
+        <w:t>thical awareness</w:t>
+      </w:r>
+      <w:r>
+        <w:t xml:space="preserve"> when I</w:t>
+      </w:r>
+      <w:r>
+        <w:t xml:space="preserve"> </w:t>
+      </w:r>
+      <w:r>
+        <w:t>avoided scraping data excessively</w:t>
+      </w:r>
+      <w:r>
+        <w:t>.</w:t>
+      </w:r>
+    </w:p>
+    <w:p>
+      <w:pPr>
+        <w:pStyle w:val="ListParagraph"/>
+        <w:numPr>
+          <w:ilvl w:val="0"/>
+          <w:numId w:val="18"/>
+        </w:numPr>
+      </w:pPr>
+      <w:r>
+        <w:t xml:space="preserve">Creativity in </w:t>
+      </w:r>
+      <w:r>
+        <w:t>use of colour</w:t>
+      </w:r>
+      <w:r>
+        <w:t xml:space="preserve"> and chart design</w:t>
+      </w:r>
+      <w:r>
+        <w:t>.</w:t>
+      </w:r>
+    </w:p>
+    <w:p>
+      <w:pPr>
+        <w:pStyle w:val="ListParagraph"/>
+      </w:pPr>
+    </w:p>
+    <w:p>
+      <w:pPr>
+        <w:pStyle w:val="Heading2"/>
+      </w:pPr>
+      <w:bookmarkStart w:id="12" w:name="_Toc216033702"/>
       <w:r>
         <w:rPr>
           <w:rStyle w:val="Strong"/>
@@ -1363,51 +1670,66 @@
         </w:rPr>
         <w:t>Weaknesses</w:t>
       </w:r>
-    </w:p>
-    <w:p>
-      <w:pPr>
-        <w:pStyle w:val="NormalWeb"/>
-        <w:numPr>
-          <w:ilvl w:val="1"/>
-          <w:numId w:val="14"/>
-        </w:numPr>
-      </w:pPr>
-      <w:r>
-        <w:t>Time management (data cleaning took longer than expected).</w:t>
-      </w:r>
-    </w:p>
-    <w:p>
-      <w:pPr>
-        <w:pStyle w:val="NormalWeb"/>
-        <w:numPr>
-          <w:ilvl w:val="1"/>
-          <w:numId w:val="14"/>
-        </w:numPr>
-      </w:pPr>
-      <w:r>
-        <w:t>Initial lack of familiarity with satellite datasets.</w:t>
-      </w:r>
-    </w:p>
-    <w:p>
-      <w:pPr>
-        <w:pStyle w:val="NormalWeb"/>
-        <w:numPr>
-          <w:ilvl w:val="1"/>
-          <w:numId w:val="14"/>
-        </w:numPr>
-      </w:pPr>
-      <w:r>
-        <w:t>Reliance on rate-limited APIs slowed progress.</w:t>
-      </w:r>
-    </w:p>
-    <w:p>
-      <w:pPr>
-        <w:pStyle w:val="NormalWeb"/>
+      <w:bookmarkEnd w:id="12"/>
+    </w:p>
+    <w:p>
+      <w:pPr>
+        <w:pStyle w:val="ListParagraph"/>
         <w:numPr>
           <w:ilvl w:val="0"/>
-          <w:numId w:val="14"/>
+          <w:numId w:val="20"/>
         </w:numPr>
       </w:pPr>
+      <w:r>
+        <w:t>Time management (</w:t>
+      </w:r>
+      <w:r>
+        <w:t xml:space="preserve">finding suitable datasets and then </w:t>
+      </w:r>
+      <w:r>
+        <w:t>data cleaning took longer than expected).</w:t>
+      </w:r>
+    </w:p>
+    <w:p>
+      <w:pPr>
+        <w:pStyle w:val="ListParagraph"/>
+        <w:numPr>
+          <w:ilvl w:val="0"/>
+          <w:numId w:val="20"/>
+        </w:numPr>
+      </w:pPr>
+      <w:r>
+        <w:t xml:space="preserve">Initial lack of familiarity with satellite </w:t>
+      </w:r>
+      <w:r>
+        <w:t xml:space="preserve">terminology and </w:t>
+      </w:r>
+      <w:r>
+        <w:t>datasets.</w:t>
+      </w:r>
+    </w:p>
+    <w:p>
+      <w:pPr>
+        <w:pStyle w:val="ListParagraph"/>
+        <w:numPr>
+          <w:ilvl w:val="0"/>
+          <w:numId w:val="20"/>
+        </w:numPr>
+      </w:pPr>
+      <w:r>
+        <w:t>I use LLMs like a ‘clever Google’ rather than being an AI native, which would likely speed me up.</w:t>
+      </w:r>
+    </w:p>
+    <w:p>
+      <w:pPr>
+        <w:pStyle w:val="ListParagraph"/>
+      </w:pPr>
+    </w:p>
+    <w:p>
+      <w:pPr>
+        <w:pStyle w:val="Heading2"/>
+      </w:pPr>
+      <w:bookmarkStart w:id="13" w:name="_Toc216033703"/>
       <w:r>
         <w:rPr>
           <w:rStyle w:val="Strong"/>
@@ -1415,25 +1737,29 @@
         </w:rPr>
         <w:t>Skills Gained</w:t>
       </w:r>
-    </w:p>
-    <w:p>
-      <w:pPr>
-        <w:pStyle w:val="NormalWeb"/>
+      <w:bookmarkEnd w:id="13"/>
+    </w:p>
+    <w:p>
+      <w:pPr>
+        <w:pStyle w:val="ListParagraph"/>
         <w:numPr>
-          <w:ilvl w:val="1"/>
-          <w:numId w:val="14"/>
+          <w:ilvl w:val="0"/>
+          <w:numId w:val="19"/>
         </w:numPr>
       </w:pPr>
       <w:r>
-        <w:t>Advanced data cleaning and feature engineering.</w:t>
-      </w:r>
-    </w:p>
-    <w:p>
-      <w:pPr>
-        <w:pStyle w:val="NormalWeb"/>
+        <w:t xml:space="preserve">Improved at </w:t>
+      </w:r>
+      <w:r>
+        <w:t>data cleaning and feature engineering.</w:t>
+      </w:r>
+    </w:p>
+    <w:p>
+      <w:pPr>
+        <w:pStyle w:val="ListParagraph"/>
         <w:numPr>
-          <w:ilvl w:val="1"/>
-          <w:numId w:val="14"/>
+          <w:ilvl w:val="0"/>
+          <w:numId w:val="19"/>
         </w:numPr>
       </w:pPr>
       <w:r>
@@ -1442,206 +1768,552 @@
     </w:p>
     <w:p>
       <w:pPr>
-        <w:pStyle w:val="NormalWeb"/>
+        <w:pStyle w:val="ListParagraph"/>
         <w:numPr>
-          <w:ilvl w:val="1"/>
-          <w:numId w:val="14"/>
+          <w:ilvl w:val="0"/>
+          <w:numId w:val="19"/>
         </w:numPr>
       </w:pPr>
       <w:r>
+        <w:t>Geocoding and handling API constraints.</w:t>
+      </w:r>
+    </w:p>
+    <w:p>
+      <w:pPr>
+        <w:pStyle w:val="ListParagraph"/>
+        <w:numPr>
+          <w:ilvl w:val="0"/>
+          <w:numId w:val="19"/>
+        </w:numPr>
+      </w:pPr>
+      <w:r>
+        <w:t>Improved python coding skills</w:t>
+      </w:r>
+      <w:r>
+        <w:t>, such as more use of lambda.</w:t>
+      </w:r>
+    </w:p>
+    <w:p>
+      <w:pPr>
+        <w:pStyle w:val="ListParagraph"/>
+        <w:numPr>
+          <w:ilvl w:val="0"/>
+          <w:numId w:val="19"/>
+        </w:numPr>
+      </w:pPr>
+      <w:r>
+        <w:t>Learned how to apply colours to charts.</w:t>
+      </w:r>
+    </w:p>
+    <w:p>
+      <w:pPr>
+        <w:pStyle w:val="ListParagraph"/>
+        <w:numPr>
+          <w:ilvl w:val="0"/>
+          <w:numId w:val="19"/>
+        </w:numPr>
+      </w:pPr>
+      <w:r>
+        <w:t xml:space="preserve">Working with fine detail in </w:t>
+      </w:r>
+      <w:r>
+        <w:t>positioning</w:t>
+      </w:r>
+      <w:r>
+        <w:t xml:space="preserve"> graph</w:t>
+      </w:r>
+      <w:r>
+        <w:t xml:space="preserve"> elements and creating custom category labels.</w:t>
+      </w:r>
+    </w:p>
+    <w:p>
+      <w:pPr>
+        <w:spacing w:after="0"/>
+        <w:jc w:val="left"/>
+        <w:rPr>
+          <w:rFonts w:eastAsia="Noto Sans CJK SC"/>
+          <w:b/>
+          <w:bCs/>
+          <w:sz w:val="32"/>
+          <w:szCs w:val="32"/>
+        </w:rPr>
+      </w:pPr>
+      <w:r>
+        <w:br w:type="page"/>
+      </w:r>
+    </w:p>
+    <w:p>
+      <w:pPr>
+        <w:pStyle w:val="Heading1"/>
+      </w:pPr>
+      <w:bookmarkStart w:id="14" w:name="_Toc216033704"/>
+      <w:r>
         <w:lastRenderedPageBreak/>
-        <w:t>Geocoding and handling API constraints.</w:t>
-      </w:r>
-    </w:p>
-    <w:p>
-      <w:pPr>
-        <w:pStyle w:val="NormalWeb"/>
-        <w:numPr>
-          <w:ilvl w:val="1"/>
-          <w:numId w:val="14"/>
-        </w:numPr>
-      </w:pPr>
-      <w:r>
-        <w:t>Storyboarding for presentations.</w:t>
-      </w:r>
-    </w:p>
-    <w:p>
-      <w:pPr>
-        <w:pStyle w:val="Heading3"/>
-      </w:pPr>
-      <w:bookmarkStart w:id="11" w:name="_Toc215684317"/>
-      <w:r>
-        <w:t xml:space="preserve">4. </w:t>
-      </w:r>
+        <w:t>Presentation</w:t>
+      </w:r>
+      <w:bookmarkEnd w:id="14"/>
+    </w:p>
+    <w:p>
+      <w:r>
+        <w:t xml:space="preserve">I used PowerPoint </w:t>
+      </w:r>
+      <w:r>
+        <w:t xml:space="preserve">to create my </w:t>
+      </w:r>
+      <w:r>
+        <w:t xml:space="preserve">presentation storyboard. </w:t>
+      </w:r>
+      <w:r>
+        <w:t xml:space="preserve">I have created many hundreds of presentations over the years, and I find the slide sorter is </w:t>
+      </w:r>
+      <w:r>
+        <w:t>useful to</w:t>
+      </w:r>
+      <w:r>
+        <w:t xml:space="preserve"> organise ideas. Slides are easily rearranged, added and removed. </w:t>
+      </w:r>
+      <w:r>
+        <w:t xml:space="preserve">From experience, presentations </w:t>
+      </w:r>
+      <w:r>
+        <w:t xml:space="preserve">should </w:t>
+      </w:r>
+      <w:r>
+        <w:t xml:space="preserve">aim </w:t>
+      </w:r>
+      <w:r>
+        <w:t>follow a story</w:t>
+      </w:r>
+      <w:r>
+        <w:t xml:space="preserve">. </w:t>
+      </w:r>
+    </w:p>
+    <w:p>
+      <w:r>
+        <w:t xml:space="preserve">Once defined, the structure and slide titles suggest the graphs </w:t>
+      </w:r>
+      <w:r>
+        <w:t>and infographics that would best illustrate the point being made. The titles are positioned so to give the maximum space for the charts.</w:t>
+      </w:r>
+    </w:p>
+    <w:p>
+      <w:r>
+        <w:rPr>
+          <w:noProof/>
+        </w:rPr>
+        <w:drawing>
+          <wp:anchor distT="0" distB="0" distL="0" distR="0" simplePos="0" relativeHeight="251661312" behindDoc="0" locked="0" layoutInCell="0" allowOverlap="1" wp14:anchorId="3EDE116C" wp14:editId="391FDAFE">
+            <wp:simplePos x="0" y="0"/>
+            <wp:positionH relativeFrom="column">
+              <wp:posOffset>-33020</wp:posOffset>
+            </wp:positionH>
+            <wp:positionV relativeFrom="paragraph">
+              <wp:posOffset>821193</wp:posOffset>
+            </wp:positionV>
+            <wp:extent cx="3390900" cy="572135"/>
+            <wp:effectExtent l="0" t="0" r="0" b="0"/>
+            <wp:wrapTopAndBottom/>
+            <wp:docPr id="2" name="Image11" descr="A blue and orange rectangular object&#10;&#10;AI-generated content may be incorrect."/>
+            <wp:cNvGraphicFramePr>
+              <a:graphicFrameLocks xmlns:a="http://schemas.openxmlformats.org/drawingml/2006/main" noChangeAspect="1"/>
+            </wp:cNvGraphicFramePr>
+            <a:graphic xmlns:a="http://schemas.openxmlformats.org/drawingml/2006/main">
+              <a:graphicData uri="http://schemas.openxmlformats.org/drawingml/2006/picture">
+                <pic:pic xmlns:pic="http://schemas.openxmlformats.org/drawingml/2006/picture">
+                  <pic:nvPicPr>
+                    <pic:cNvPr id="2" name="Image11" descr="A blue and orange rectangular object&#10;&#10;AI-generated content may be incorrect."/>
+                    <pic:cNvPicPr>
+                      <a:picLocks noChangeAspect="1" noChangeArrowheads="1"/>
+                    </pic:cNvPicPr>
+                  </pic:nvPicPr>
+                  <pic:blipFill>
+                    <a:blip r:embed="rId10"/>
+                    <a:stretch>
+                      <a:fillRect/>
+                    </a:stretch>
+                  </pic:blipFill>
+                  <pic:spPr bwMode="auto">
+                    <a:xfrm>
+                      <a:off x="0" y="0"/>
+                      <a:ext cx="3390900" cy="572135"/>
+                    </a:xfrm>
+                    <a:prstGeom prst="rect">
+                      <a:avLst/>
+                    </a:prstGeom>
+                  </pic:spPr>
+                </pic:pic>
+              </a:graphicData>
+            </a:graphic>
+            <wp14:sizeRelH relativeFrom="margin">
+              <wp14:pctWidth>0</wp14:pctWidth>
+            </wp14:sizeRelH>
+            <wp14:sizeRelV relativeFrom="margin">
+              <wp14:pctHeight>0</wp14:pctHeight>
+            </wp14:sizeRelV>
+          </wp:anchor>
+        </w:drawing>
+      </w:r>
+      <w:r>
+        <w:t xml:space="preserve">Colour is a key component of data visualisation. </w:t>
+      </w:r>
+      <w:r>
+        <w:t xml:space="preserve">The colour scheme was chosen to be vibrant and engaging. </w:t>
+      </w:r>
+      <w:r>
+        <w:t>Brigh</w:t>
+      </w:r>
+      <w:r>
+        <w:t>t</w:t>
+      </w:r>
+      <w:r>
+        <w:t>, high</w:t>
+      </w:r>
+      <w:r>
+        <w:noBreakHyphen/>
+        <w:t>contrast colours</w:t>
+      </w:r>
+      <w:r>
+        <w:t xml:space="preserve"> were chosen to</w:t>
+      </w:r>
+      <w:r>
+        <w:t xml:space="preserve"> stand out vividly against the dark blue background</w:t>
+      </w:r>
+      <w:r>
+        <w:t xml:space="preserve"> as shown below. The blue background is designed to evoke a ‘space theme’ without being as stark as pure black.</w:t>
+      </w:r>
+    </w:p>
+    <w:p/>
+    <w:p>
+      <w:r>
+        <w:t xml:space="preserve">There are no interactive charts in the presentation. </w:t>
+      </w:r>
+      <w:r>
+        <w:t>This is a deliberate choice from</w:t>
+      </w:r>
+      <w:r>
+        <w:t xml:space="preserve"> years of experience delivering training courses and technical presentations</w:t>
+      </w:r>
+      <w:r>
+        <w:t>.</w:t>
+      </w:r>
+      <w:r>
+        <w:t xml:space="preserve"> </w:t>
+      </w:r>
+      <w:r>
+        <w:t xml:space="preserve">I </w:t>
+      </w:r>
+      <w:r>
+        <w:t xml:space="preserve">would </w:t>
+      </w:r>
+      <w:r>
+        <w:t>find</w:t>
+      </w:r>
+      <w:r>
+        <w:t xml:space="preserve"> ‘driving’ an interactive chart </w:t>
+      </w:r>
+      <w:r>
+        <w:t>fraught</w:t>
+      </w:r>
+      <w:r>
+        <w:t xml:space="preserve"> with</w:t>
+      </w:r>
+      <w:r>
+        <w:t xml:space="preserve"> danger </w:t>
+      </w:r>
+      <w:r>
+        <w:t>during</w:t>
+      </w:r>
+      <w:r>
+        <w:t xml:space="preserve"> a live presentation. </w:t>
+      </w:r>
+    </w:p>
+    <w:p>
+      <w:r>
+        <w:t xml:space="preserve">For this purpose, </w:t>
+      </w:r>
+      <w:r>
+        <w:t xml:space="preserve">I would prefer to </w:t>
+      </w:r>
+      <w:r>
+        <w:t>pre-</w:t>
+      </w:r>
+      <w:r>
+        <w:t>generate a</w:t>
+      </w:r>
+      <w:r>
+        <w:t>n</w:t>
+      </w:r>
+      <w:r>
+        <w:t xml:space="preserve"> animation showing data changing on a chart. </w:t>
+      </w:r>
+      <w:r>
+        <w:t xml:space="preserve">For this presentation </w:t>
+      </w:r>
+      <w:r>
+        <w:t>I created a simple animation within PowerPoint to show a cascade.</w:t>
+      </w:r>
+    </w:p>
+    <w:p>
+      <w:r>
+        <w:t>If we had been asked to produce a website or dashboard specifically, I would have made my charts interactive to allow the user to explore the data in their own way. However, in a presentation the story is led by the presenter, so there was no need.</w:t>
+      </w:r>
+    </w:p>
+    <w:p>
+      <w:r>
+        <w:t>Once the visuals were complete, the narration track was recorded</w:t>
+      </w:r>
+      <w:r>
+        <w:t xml:space="preserve">. </w:t>
+      </w:r>
+      <w:r>
+        <w:t>I c</w:t>
+      </w:r>
+      <w:r>
+        <w:t xml:space="preserve">hose not to put video of </w:t>
+      </w:r>
+      <w:r>
+        <w:t>mys</w:t>
+      </w:r>
+      <w:r>
+        <w:t>elf in</w:t>
+      </w:r>
+      <w:r>
+        <w:t>to the presentation</w:t>
+      </w:r>
+      <w:r>
+        <w:t xml:space="preserve"> as the</w:t>
+      </w:r>
+      <w:r>
+        <w:t xml:space="preserve">re </w:t>
+      </w:r>
+      <w:r>
+        <w:t xml:space="preserve">would be no </w:t>
+      </w:r>
+      <w:r>
+        <w:t xml:space="preserve">suitable </w:t>
+      </w:r>
+      <w:r>
+        <w:t>place on most slides to accept the ‘</w:t>
+      </w:r>
+      <w:r>
+        <w:t>C</w:t>
+      </w:r>
+      <w:r>
+        <w:t>ameo’ video recording</w:t>
+      </w:r>
+      <w:r>
+        <w:t xml:space="preserve"> without overwriting a graph visual.</w:t>
+      </w:r>
+    </w:p>
+    <w:p>
+      <w:r>
+        <w:t>I wanted the presentation to have a ‘space feel’</w:t>
+      </w:r>
+      <w:r>
+        <w:t>, so I experimented with several ‘ambient’ music tracks as backing music</w:t>
+      </w:r>
+      <w:r>
+        <w:t xml:space="preserve"> and was</w:t>
+      </w:r>
+      <w:r>
+        <w:t xml:space="preserve"> able to find some suitable royalty free music</w:t>
+      </w:r>
+      <w:r>
+        <w:t>. I needed to u</w:t>
+      </w:r>
+      <w:r>
+        <w:t xml:space="preserve">se </w:t>
+      </w:r>
+      <w:proofErr w:type="spellStart"/>
+      <w:r>
+        <w:t>ffmpeg</w:t>
+      </w:r>
+      <w:proofErr w:type="spellEnd"/>
+      <w:r>
+        <w:t xml:space="preserve"> </w:t>
+      </w:r>
+      <w:r>
+        <w:t xml:space="preserve">on my MacBook </w:t>
+      </w:r>
+      <w:r>
+        <w:t xml:space="preserve">to </w:t>
+      </w:r>
+      <w:r>
+        <w:t>reduce</w:t>
+      </w:r>
+      <w:r>
+        <w:t xml:space="preserve"> the music audio level</w:t>
+      </w:r>
+      <w:r>
+        <w:t xml:space="preserve"> </w:t>
+      </w:r>
+      <w:r>
+        <w:t>and</w:t>
+      </w:r>
+      <w:r>
+        <w:t xml:space="preserve"> </w:t>
+      </w:r>
+      <w:r>
+        <w:t xml:space="preserve">to create a mono version of the final </w:t>
+      </w:r>
+      <w:r>
+        <w:t>video. The video file was uploaded to YouTube</w:t>
+      </w:r>
+      <w:r>
+        <w:rPr>
+          <w:rStyle w:val="FootnoteReference"/>
+        </w:rPr>
+        <w:footnoteReference w:id="1"/>
+      </w:r>
+      <w:r>
+        <w:t>.</w:t>
+      </w:r>
+    </w:p>
+    <w:p>
+      <w:r>
+        <w:t>The final elements</w:t>
+      </w:r>
+      <w:r>
+        <w:t xml:space="preserve"> of the story were not told directly with charts, but through words drawn from research, backed up by </w:t>
+      </w:r>
+      <w:r>
+        <w:t xml:space="preserve">facts from </w:t>
+      </w:r>
+      <w:r>
+        <w:t>my analysis of the data.</w:t>
+      </w:r>
+      <w:r>
+        <w:t xml:space="preserve"> </w:t>
+      </w:r>
+    </w:p>
+    <w:p/>
+    <w:p>
+      <w:pPr>
+        <w:rPr>
+          <w:rStyle w:val="Strong"/>
+          <w:rFonts w:eastAsia="Noto Sans CJK SC"/>
+          <w:sz w:val="36"/>
+          <w:szCs w:val="36"/>
+        </w:rPr>
+      </w:pPr>
+      <w:r>
+        <w:rPr>
+          <w:rStyle w:val="Strong"/>
+          <w:b w:val="0"/>
+          <w:bCs w:val="0"/>
+        </w:rPr>
+        <w:br w:type="page"/>
+      </w:r>
+    </w:p>
+    <w:p>
+      <w:pPr>
+        <w:pStyle w:val="Heading1"/>
+      </w:pPr>
+      <w:bookmarkStart w:id="15" w:name="_Toc216033705"/>
       <w:r>
         <w:rPr>
           <w:rStyle w:val="Strong"/>
           <w:b/>
           <w:bCs/>
         </w:rPr>
-        <w:t>Strategies Undertaken</w:t>
-      </w:r>
-      <w:bookmarkEnd w:id="11"/>
-    </w:p>
-    <w:p>
-      <w:pPr>
-        <w:pStyle w:val="NormalWeb"/>
-        <w:numPr>
-          <w:ilvl w:val="0"/>
-          <w:numId w:val="15"/>
-        </w:numPr>
-      </w:pPr>
-      <w:r>
-        <w:t>Iterative exploration of datasets (NASA → UCS → N2YO → McDowell).</w:t>
-      </w:r>
-    </w:p>
-    <w:p>
-      <w:pPr>
-        <w:pStyle w:val="NormalWeb"/>
-        <w:numPr>
-          <w:ilvl w:val="0"/>
-          <w:numId w:val="15"/>
-        </w:numPr>
-      </w:pPr>
-      <w:r>
-        <w:t>Ethical decision-making (avoiding scraping).</w:t>
-      </w:r>
-    </w:p>
-    <w:p>
-      <w:pPr>
-        <w:pStyle w:val="NormalWeb"/>
-        <w:numPr>
-          <w:ilvl w:val="0"/>
-          <w:numId w:val="15"/>
-        </w:numPr>
-      </w:pPr>
-      <w:r>
-        <w:t>Use of multiple Python libraries for different chart types.</w:t>
-      </w:r>
-    </w:p>
-    <w:p>
-      <w:pPr>
-        <w:pStyle w:val="NormalWeb"/>
-        <w:numPr>
-          <w:ilvl w:val="0"/>
-          <w:numId w:val="15"/>
-        </w:numPr>
-      </w:pPr>
-      <w:r>
-        <w:t>Careful palette selection for accessibility and impact.</w:t>
-      </w:r>
-    </w:p>
-    <w:p>
-      <w:pPr>
-        <w:pStyle w:val="NormalWeb"/>
-        <w:numPr>
-          <w:ilvl w:val="0"/>
-          <w:numId w:val="15"/>
-        </w:numPr>
-      </w:pPr>
-      <w:r>
-        <w:t>Building a narrative flow through storyboard design.</w:t>
-      </w:r>
-    </w:p>
-    <w:p>
-      <w:pPr>
-        <w:pStyle w:val="Heading3"/>
-      </w:pPr>
-      <w:bookmarkStart w:id="12" w:name="_Toc215684318"/>
-      <w:r>
-        <w:t xml:space="preserve">5. </w:t>
-      </w:r>
-      <w:r>
-        <w:rPr>
-          <w:rStyle w:val="Strong"/>
-          <w:b/>
-          <w:bCs/>
-        </w:rPr>
-        <w:t>Looking Ahead</w:t>
-      </w:r>
-      <w:bookmarkEnd w:id="12"/>
-    </w:p>
-    <w:p>
-      <w:pPr>
-        <w:pStyle w:val="NormalWeb"/>
-        <w:numPr>
-          <w:ilvl w:val="0"/>
-          <w:numId w:val="16"/>
-        </w:numPr>
-      </w:pPr>
-      <w:r>
-        <w:rPr>
-          <w:rStyle w:val="Strong"/>
-          <w:rFonts w:eastAsia="OpenSymbol"/>
-        </w:rPr>
-        <w:t>What have I learned about myself?</w:t>
-      </w:r>
-      <w:r>
-        <w:t xml:space="preserve"> That you can adapt quickly, persevere through technical challenges, and balance technical rigour with creative presentation.</w:t>
-      </w:r>
-    </w:p>
-    <w:p>
-      <w:pPr>
-        <w:pStyle w:val="NormalWeb"/>
-        <w:numPr>
-          <w:ilvl w:val="0"/>
-          <w:numId w:val="16"/>
-        </w:numPr>
-      </w:pPr>
-      <w:r>
-        <w:rPr>
-          <w:rStyle w:val="Strong"/>
-          <w:rFonts w:eastAsia="OpenSymbol"/>
-        </w:rPr>
-        <w:t>What next?</w:t>
-      </w:r>
-    </w:p>
-    <w:p>
-      <w:pPr>
-        <w:pStyle w:val="NormalWeb"/>
-        <w:numPr>
-          <w:ilvl w:val="1"/>
-          <w:numId w:val="16"/>
-        </w:numPr>
-      </w:pPr>
-      <w:r>
-        <w:t>Explore automation and reproducibility (e.g., pipelines, version control).</w:t>
-      </w:r>
-    </w:p>
-    <w:p>
-      <w:pPr>
-        <w:pStyle w:val="NormalWeb"/>
-        <w:numPr>
-          <w:ilvl w:val="1"/>
-          <w:numId w:val="16"/>
-        </w:numPr>
-      </w:pPr>
-      <w:r>
-        <w:t>Strengthen statistical analysis skills to complement visualisation.</w:t>
-      </w:r>
-    </w:p>
-    <w:p>
-      <w:pPr>
-        <w:pStyle w:val="NormalWeb"/>
-        <w:numPr>
-          <w:ilvl w:val="1"/>
-          <w:numId w:val="16"/>
-        </w:numPr>
-      </w:pPr>
-      <w:r>
-        <w:t>Apply lessons learned to future projects involving large, messy datasets.</w:t>
-      </w:r>
-    </w:p>
-    <w:p>
-      <w:pPr>
-        <w:pStyle w:val="NormalWeb"/>
-        <w:numPr>
-          <w:ilvl w:val="1"/>
-          <w:numId w:val="16"/>
-        </w:numPr>
-      </w:pPr>
-      <w:r>
-        <w:t>Consider collaboration or peer review to refine approaches.</w:t>
+        <w:lastRenderedPageBreak/>
+        <w:t>Way Forward</w:t>
+      </w:r>
+      <w:bookmarkEnd w:id="15"/>
+    </w:p>
+    <w:p>
+      <w:r>
+        <w:t xml:space="preserve">The projects that I have carried out so far in this degree program, including this project, have served to give me a strong basis from which to work with large, complex and messy datasets in the future. </w:t>
+      </w:r>
+      <w:r>
+        <w:t xml:space="preserve">I have learned that I am able to adapt and persevere through new technical challenges. </w:t>
+      </w:r>
+    </w:p>
+    <w:p>
+      <w:r>
+        <w:t xml:space="preserve">I have learned that I can work well with python to produce interesting and visually appealing charts. </w:t>
+      </w:r>
+      <w:r>
+        <w:t>When I started this degree, I had never used pandas to manipulate data before. I now realise that I have progressed a long way and gained some valuable skills. My python programming was acceptable before, but I am now happy to use more complex features such as lambda functions.</w:t>
+      </w:r>
+    </w:p>
+    <w:p>
+      <w:r>
+        <w:t xml:space="preserve">There are a variety of visualisation libraries that I have explored in detail in this project. I now know how to produce composite labels, to change fonts and </w:t>
+      </w:r>
+      <w:r>
+        <w:t>chart colours, and to create custom gradient colour maps.</w:t>
+      </w:r>
+    </w:p>
+    <w:p>
+      <w:r>
+        <w:t xml:space="preserve">I have created a template </w:t>
+      </w:r>
+      <w:proofErr w:type="spellStart"/>
+      <w:r>
+        <w:t>Jupyter</w:t>
+      </w:r>
+      <w:proofErr w:type="spellEnd"/>
+      <w:r>
+        <w:t xml:space="preserve"> notebook that includes repeatable functions for all the techniques that I have learned.</w:t>
+      </w:r>
+    </w:p>
+    <w:p>
+      <w:r>
+        <w:t>I am more expert in using python for data analysis and visualisation than other tools I have available</w:t>
+      </w:r>
+      <w:r>
+        <w:t>.</w:t>
+      </w:r>
+      <w:r>
+        <w:t xml:space="preserve"> </w:t>
+      </w:r>
+      <w:proofErr w:type="gramStart"/>
+      <w:r>
+        <w:t>I</w:t>
+      </w:r>
+      <w:proofErr w:type="gramEnd"/>
+      <w:r>
+        <w:t xml:space="preserve"> will aim to do some </w:t>
+      </w:r>
+      <w:r>
+        <w:t xml:space="preserve">workplace </w:t>
+      </w:r>
+      <w:r>
+        <w:t xml:space="preserve">projects in other tools, like Tableau, </w:t>
+      </w:r>
+      <w:proofErr w:type="spellStart"/>
+      <w:r>
+        <w:t>PowerBI</w:t>
+      </w:r>
+      <w:proofErr w:type="spellEnd"/>
+      <w:r>
+        <w:t xml:space="preserve">, and the ‘R’ language to give myself a broader range of experience to draw from. </w:t>
+      </w:r>
+      <w:r>
+        <w:t>I will also spend some time strengthening my statistical analysis skills.</w:t>
+      </w:r>
+    </w:p>
+    <w:p>
+      <w:r>
+        <w:t>I should also learn to use the AI tools that I have at my disposal to help me write code. This would speed up the data analysis stages and assist me to create graphs more quickly with fewer iterations.</w:t>
+      </w:r>
+    </w:p>
+    <w:p>
+      <w:r>
+        <w:t xml:space="preserve">This </w:t>
+      </w:r>
+      <w:r>
+        <w:t xml:space="preserve">all </w:t>
+      </w:r>
+      <w:r>
+        <w:t xml:space="preserve">applies to </w:t>
+      </w:r>
+      <w:r>
+        <w:t xml:space="preserve">and complements </w:t>
+      </w:r>
+      <w:r>
+        <w:t>my work in cyber security, as often our data is unstructured and complicated to process.</w:t>
       </w:r>
     </w:p>
     <w:p>
@@ -1653,9 +2325,14 @@
         </w:numPr>
       </w:pPr>
     </w:p>
+    <w:p>
+      <w:pPr>
+        <w:pStyle w:val="BodyText"/>
+      </w:pPr>
+    </w:p>
     <w:sectPr>
-      <w:headerReference w:type="default" r:id="rId10"/>
-      <w:footerReference w:type="default" r:id="rId11"/>
+      <w:headerReference w:type="default" r:id="rId11"/>
+      <w:footerReference w:type="default" r:id="rId12"/>
       <w:pgSz w:w="11906" w:h="16838"/>
       <w:pgMar w:top="1705" w:right="1134" w:bottom="1693" w:left="1134" w:header="1134" w:footer="1134" w:gutter="0"/>
       <w:cols w:space="720"/>
@@ -1691,7 +2368,6 @@
   <w:p>
     <w:pPr>
       <w:pStyle w:val="Footer"/>
-      <w:jc w:val="center"/>
     </w:pPr>
     <w:r>
       <w:t xml:space="preserve">Page </w:t>
@@ -1749,6 +2425,25 @@
       </w:pPr>
       <w:r>
         <w:continuationSeparator/>
+      </w:r>
+    </w:p>
+  </w:footnote>
+  <w:footnote w:id="1">
+    <w:p>
+      <w:pPr>
+        <w:pStyle w:val="FootnoteText"/>
+      </w:pPr>
+      <w:r>
+        <w:rPr>
+          <w:rStyle w:val="FootnoteReference"/>
+        </w:rPr>
+        <w:footnoteRef/>
+      </w:r>
+      <w:r>
+        <w:t xml:space="preserve"> </w:t>
+      </w:r>
+      <w:r>
+        <w:t>https://youtu.be/OMqgP5Ol7jo</w:t>
       </w:r>
     </w:p>
   </w:footnote>
@@ -1922,6 +2617,119 @@
     </w:lvl>
   </w:abstractNum>
   <w:abstractNum w:abstractNumId="1" w15:restartNumberingAfterBreak="0">
+    <w:nsid w:val="0BF2011A"/>
+    <w:multiLevelType w:val="hybridMultilevel"/>
+    <w:tmpl w:val="C66CD220"/>
+    <w:lvl w:ilvl="0" w:tplc="08090001">
+      <w:start w:val="1"/>
+      <w:numFmt w:val="bullet"/>
+      <w:lvlText w:val=""/>
+      <w:lvlJc w:val="left"/>
+      <w:pPr>
+        <w:ind w:left="720" w:hanging="360"/>
+      </w:pPr>
+      <w:rPr>
+        <w:rFonts w:ascii="Symbol" w:hAnsi="Symbol" w:hint="default"/>
+      </w:rPr>
+    </w:lvl>
+    <w:lvl w:ilvl="1" w:tplc="08090003" w:tentative="1">
+      <w:start w:val="1"/>
+      <w:numFmt w:val="bullet"/>
+      <w:lvlText w:val="o"/>
+      <w:lvlJc w:val="left"/>
+      <w:pPr>
+        <w:ind w:left="1440" w:hanging="360"/>
+      </w:pPr>
+      <w:rPr>
+        <w:rFonts w:ascii="Courier New" w:hAnsi="Courier New" w:cs="Courier New" w:hint="default"/>
+      </w:rPr>
+    </w:lvl>
+    <w:lvl w:ilvl="2" w:tplc="08090005" w:tentative="1">
+      <w:start w:val="1"/>
+      <w:numFmt w:val="bullet"/>
+      <w:lvlText w:val=""/>
+      <w:lvlJc w:val="left"/>
+      <w:pPr>
+        <w:ind w:left="2160" w:hanging="360"/>
+      </w:pPr>
+      <w:rPr>
+        <w:rFonts w:ascii="Wingdings" w:hAnsi="Wingdings" w:hint="default"/>
+      </w:rPr>
+    </w:lvl>
+    <w:lvl w:ilvl="3" w:tplc="08090001" w:tentative="1">
+      <w:start w:val="1"/>
+      <w:numFmt w:val="bullet"/>
+      <w:lvlText w:val=""/>
+      <w:lvlJc w:val="left"/>
+      <w:pPr>
+        <w:ind w:left="2880" w:hanging="360"/>
+      </w:pPr>
+      <w:rPr>
+        <w:rFonts w:ascii="Symbol" w:hAnsi="Symbol" w:hint="default"/>
+      </w:rPr>
+    </w:lvl>
+    <w:lvl w:ilvl="4" w:tplc="08090003" w:tentative="1">
+      <w:start w:val="1"/>
+      <w:numFmt w:val="bullet"/>
+      <w:lvlText w:val="o"/>
+      <w:lvlJc w:val="left"/>
+      <w:pPr>
+        <w:ind w:left="3600" w:hanging="360"/>
+      </w:pPr>
+      <w:rPr>
+        <w:rFonts w:ascii="Courier New" w:hAnsi="Courier New" w:cs="Courier New" w:hint="default"/>
+      </w:rPr>
+    </w:lvl>
+    <w:lvl w:ilvl="5" w:tplc="08090005" w:tentative="1">
+      <w:start w:val="1"/>
+      <w:numFmt w:val="bullet"/>
+      <w:lvlText w:val=""/>
+      <w:lvlJc w:val="left"/>
+      <w:pPr>
+        <w:ind w:left="4320" w:hanging="360"/>
+      </w:pPr>
+      <w:rPr>
+        <w:rFonts w:ascii="Wingdings" w:hAnsi="Wingdings" w:hint="default"/>
+      </w:rPr>
+    </w:lvl>
+    <w:lvl w:ilvl="6" w:tplc="08090001" w:tentative="1">
+      <w:start w:val="1"/>
+      <w:numFmt w:val="bullet"/>
+      <w:lvlText w:val=""/>
+      <w:lvlJc w:val="left"/>
+      <w:pPr>
+        <w:ind w:left="5040" w:hanging="360"/>
+      </w:pPr>
+      <w:rPr>
+        <w:rFonts w:ascii="Symbol" w:hAnsi="Symbol" w:hint="default"/>
+      </w:rPr>
+    </w:lvl>
+    <w:lvl w:ilvl="7" w:tplc="08090003" w:tentative="1">
+      <w:start w:val="1"/>
+      <w:numFmt w:val="bullet"/>
+      <w:lvlText w:val="o"/>
+      <w:lvlJc w:val="left"/>
+      <w:pPr>
+        <w:ind w:left="5760" w:hanging="360"/>
+      </w:pPr>
+      <w:rPr>
+        <w:rFonts w:ascii="Courier New" w:hAnsi="Courier New" w:cs="Courier New" w:hint="default"/>
+      </w:rPr>
+    </w:lvl>
+    <w:lvl w:ilvl="8" w:tplc="08090005" w:tentative="1">
+      <w:start w:val="1"/>
+      <w:numFmt w:val="bullet"/>
+      <w:lvlText w:val=""/>
+      <w:lvlJc w:val="left"/>
+      <w:pPr>
+        <w:ind w:left="6480" w:hanging="360"/>
+      </w:pPr>
+      <w:rPr>
+        <w:rFonts w:ascii="Wingdings" w:hAnsi="Wingdings" w:hint="default"/>
+      </w:rPr>
+    </w:lvl>
+  </w:abstractNum>
+  <w:abstractNum w:abstractNumId="2" w15:restartNumberingAfterBreak="0">
     <w:nsid w:val="0F3770F6"/>
     <w:multiLevelType w:val="multilevel"/>
     <w:tmpl w:val="99B4F76C"/>
@@ -2061,7 +2869,120 @@
       </w:rPr>
     </w:lvl>
   </w:abstractNum>
-  <w:abstractNum w:abstractNumId="2" w15:restartNumberingAfterBreak="0">
+  <w:abstractNum w:abstractNumId="3" w15:restartNumberingAfterBreak="0">
+    <w:nsid w:val="11BE53A4"/>
+    <w:multiLevelType w:val="hybridMultilevel"/>
+    <w:tmpl w:val="22264DFE"/>
+    <w:lvl w:ilvl="0" w:tplc="08090001">
+      <w:start w:val="1"/>
+      <w:numFmt w:val="bullet"/>
+      <w:lvlText w:val=""/>
+      <w:lvlJc w:val="left"/>
+      <w:pPr>
+        <w:ind w:left="720" w:hanging="360"/>
+      </w:pPr>
+      <w:rPr>
+        <w:rFonts w:ascii="Symbol" w:hAnsi="Symbol" w:hint="default"/>
+      </w:rPr>
+    </w:lvl>
+    <w:lvl w:ilvl="1" w:tplc="08090003" w:tentative="1">
+      <w:start w:val="1"/>
+      <w:numFmt w:val="bullet"/>
+      <w:lvlText w:val="o"/>
+      <w:lvlJc w:val="left"/>
+      <w:pPr>
+        <w:ind w:left="1440" w:hanging="360"/>
+      </w:pPr>
+      <w:rPr>
+        <w:rFonts w:ascii="Courier New" w:hAnsi="Courier New" w:cs="Courier New" w:hint="default"/>
+      </w:rPr>
+    </w:lvl>
+    <w:lvl w:ilvl="2" w:tplc="08090005" w:tentative="1">
+      <w:start w:val="1"/>
+      <w:numFmt w:val="bullet"/>
+      <w:lvlText w:val=""/>
+      <w:lvlJc w:val="left"/>
+      <w:pPr>
+        <w:ind w:left="2160" w:hanging="360"/>
+      </w:pPr>
+      <w:rPr>
+        <w:rFonts w:ascii="Wingdings" w:hAnsi="Wingdings" w:hint="default"/>
+      </w:rPr>
+    </w:lvl>
+    <w:lvl w:ilvl="3" w:tplc="08090001" w:tentative="1">
+      <w:start w:val="1"/>
+      <w:numFmt w:val="bullet"/>
+      <w:lvlText w:val=""/>
+      <w:lvlJc w:val="left"/>
+      <w:pPr>
+        <w:ind w:left="2880" w:hanging="360"/>
+      </w:pPr>
+      <w:rPr>
+        <w:rFonts w:ascii="Symbol" w:hAnsi="Symbol" w:hint="default"/>
+      </w:rPr>
+    </w:lvl>
+    <w:lvl w:ilvl="4" w:tplc="08090003" w:tentative="1">
+      <w:start w:val="1"/>
+      <w:numFmt w:val="bullet"/>
+      <w:lvlText w:val="o"/>
+      <w:lvlJc w:val="left"/>
+      <w:pPr>
+        <w:ind w:left="3600" w:hanging="360"/>
+      </w:pPr>
+      <w:rPr>
+        <w:rFonts w:ascii="Courier New" w:hAnsi="Courier New" w:cs="Courier New" w:hint="default"/>
+      </w:rPr>
+    </w:lvl>
+    <w:lvl w:ilvl="5" w:tplc="08090005" w:tentative="1">
+      <w:start w:val="1"/>
+      <w:numFmt w:val="bullet"/>
+      <w:lvlText w:val=""/>
+      <w:lvlJc w:val="left"/>
+      <w:pPr>
+        <w:ind w:left="4320" w:hanging="360"/>
+      </w:pPr>
+      <w:rPr>
+        <w:rFonts w:ascii="Wingdings" w:hAnsi="Wingdings" w:hint="default"/>
+      </w:rPr>
+    </w:lvl>
+    <w:lvl w:ilvl="6" w:tplc="08090001" w:tentative="1">
+      <w:start w:val="1"/>
+      <w:numFmt w:val="bullet"/>
+      <w:lvlText w:val=""/>
+      <w:lvlJc w:val="left"/>
+      <w:pPr>
+        <w:ind w:left="5040" w:hanging="360"/>
+      </w:pPr>
+      <w:rPr>
+        <w:rFonts w:ascii="Symbol" w:hAnsi="Symbol" w:hint="default"/>
+      </w:rPr>
+    </w:lvl>
+    <w:lvl w:ilvl="7" w:tplc="08090003" w:tentative="1">
+      <w:start w:val="1"/>
+      <w:numFmt w:val="bullet"/>
+      <w:lvlText w:val="o"/>
+      <w:lvlJc w:val="left"/>
+      <w:pPr>
+        <w:ind w:left="5760" w:hanging="360"/>
+      </w:pPr>
+      <w:rPr>
+        <w:rFonts w:ascii="Courier New" w:hAnsi="Courier New" w:cs="Courier New" w:hint="default"/>
+      </w:rPr>
+    </w:lvl>
+    <w:lvl w:ilvl="8" w:tplc="08090005" w:tentative="1">
+      <w:start w:val="1"/>
+      <w:numFmt w:val="bullet"/>
+      <w:lvlText w:val=""/>
+      <w:lvlJc w:val="left"/>
+      <w:pPr>
+        <w:ind w:left="6480" w:hanging="360"/>
+      </w:pPr>
+      <w:rPr>
+        <w:rFonts w:ascii="Wingdings" w:hAnsi="Wingdings" w:hint="default"/>
+      </w:rPr>
+    </w:lvl>
+  </w:abstractNum>
+  <w:abstractNum w:abstractNumId="4" w15:restartNumberingAfterBreak="0">
     <w:nsid w:val="14245F7B"/>
     <w:multiLevelType w:val="multilevel"/>
     <w:tmpl w:val="55283A24"/>
@@ -2174,7 +3095,120 @@
       </w:pPr>
     </w:lvl>
   </w:abstractNum>
-  <w:abstractNum w:abstractNumId="3" w15:restartNumberingAfterBreak="0">
+  <w:abstractNum w:abstractNumId="5" w15:restartNumberingAfterBreak="0">
+    <w:nsid w:val="2DA12940"/>
+    <w:multiLevelType w:val="hybridMultilevel"/>
+    <w:tmpl w:val="819CB84E"/>
+    <w:lvl w:ilvl="0" w:tplc="08090001">
+      <w:start w:val="1"/>
+      <w:numFmt w:val="bullet"/>
+      <w:lvlText w:val=""/>
+      <w:lvlJc w:val="left"/>
+      <w:pPr>
+        <w:ind w:left="720" w:hanging="360"/>
+      </w:pPr>
+      <w:rPr>
+        <w:rFonts w:ascii="Symbol" w:hAnsi="Symbol" w:hint="default"/>
+      </w:rPr>
+    </w:lvl>
+    <w:lvl w:ilvl="1" w:tplc="08090003" w:tentative="1">
+      <w:start w:val="1"/>
+      <w:numFmt w:val="bullet"/>
+      <w:lvlText w:val="o"/>
+      <w:lvlJc w:val="left"/>
+      <w:pPr>
+        <w:ind w:left="1440" w:hanging="360"/>
+      </w:pPr>
+      <w:rPr>
+        <w:rFonts w:ascii="Courier New" w:hAnsi="Courier New" w:cs="Courier New" w:hint="default"/>
+      </w:rPr>
+    </w:lvl>
+    <w:lvl w:ilvl="2" w:tplc="08090005" w:tentative="1">
+      <w:start w:val="1"/>
+      <w:numFmt w:val="bullet"/>
+      <w:lvlText w:val=""/>
+      <w:lvlJc w:val="left"/>
+      <w:pPr>
+        <w:ind w:left="2160" w:hanging="360"/>
+      </w:pPr>
+      <w:rPr>
+        <w:rFonts w:ascii="Wingdings" w:hAnsi="Wingdings" w:hint="default"/>
+      </w:rPr>
+    </w:lvl>
+    <w:lvl w:ilvl="3" w:tplc="08090001" w:tentative="1">
+      <w:start w:val="1"/>
+      <w:numFmt w:val="bullet"/>
+      <w:lvlText w:val=""/>
+      <w:lvlJc w:val="left"/>
+      <w:pPr>
+        <w:ind w:left="2880" w:hanging="360"/>
+      </w:pPr>
+      <w:rPr>
+        <w:rFonts w:ascii="Symbol" w:hAnsi="Symbol" w:hint="default"/>
+      </w:rPr>
+    </w:lvl>
+    <w:lvl w:ilvl="4" w:tplc="08090003" w:tentative="1">
+      <w:start w:val="1"/>
+      <w:numFmt w:val="bullet"/>
+      <w:lvlText w:val="o"/>
+      <w:lvlJc w:val="left"/>
+      <w:pPr>
+        <w:ind w:left="3600" w:hanging="360"/>
+      </w:pPr>
+      <w:rPr>
+        <w:rFonts w:ascii="Courier New" w:hAnsi="Courier New" w:cs="Courier New" w:hint="default"/>
+      </w:rPr>
+    </w:lvl>
+    <w:lvl w:ilvl="5" w:tplc="08090005" w:tentative="1">
+      <w:start w:val="1"/>
+      <w:numFmt w:val="bullet"/>
+      <w:lvlText w:val=""/>
+      <w:lvlJc w:val="left"/>
+      <w:pPr>
+        <w:ind w:left="4320" w:hanging="360"/>
+      </w:pPr>
+      <w:rPr>
+        <w:rFonts w:ascii="Wingdings" w:hAnsi="Wingdings" w:hint="default"/>
+      </w:rPr>
+    </w:lvl>
+    <w:lvl w:ilvl="6" w:tplc="08090001" w:tentative="1">
+      <w:start w:val="1"/>
+      <w:numFmt w:val="bullet"/>
+      <w:lvlText w:val=""/>
+      <w:lvlJc w:val="left"/>
+      <w:pPr>
+        <w:ind w:left="5040" w:hanging="360"/>
+      </w:pPr>
+      <w:rPr>
+        <w:rFonts w:ascii="Symbol" w:hAnsi="Symbol" w:hint="default"/>
+      </w:rPr>
+    </w:lvl>
+    <w:lvl w:ilvl="7" w:tplc="08090003" w:tentative="1">
+      <w:start w:val="1"/>
+      <w:numFmt w:val="bullet"/>
+      <w:lvlText w:val="o"/>
+      <w:lvlJc w:val="left"/>
+      <w:pPr>
+        <w:ind w:left="5760" w:hanging="360"/>
+      </w:pPr>
+      <w:rPr>
+        <w:rFonts w:ascii="Courier New" w:hAnsi="Courier New" w:cs="Courier New" w:hint="default"/>
+      </w:rPr>
+    </w:lvl>
+    <w:lvl w:ilvl="8" w:tplc="08090005" w:tentative="1">
+      <w:start w:val="1"/>
+      <w:numFmt w:val="bullet"/>
+      <w:lvlText w:val=""/>
+      <w:lvlJc w:val="left"/>
+      <w:pPr>
+        <w:ind w:left="6480" w:hanging="360"/>
+      </w:pPr>
+      <w:rPr>
+        <w:rFonts w:ascii="Wingdings" w:hAnsi="Wingdings" w:hint="default"/>
+      </w:rPr>
+    </w:lvl>
+  </w:abstractNum>
+  <w:abstractNum w:abstractNumId="6" w15:restartNumberingAfterBreak="0">
     <w:nsid w:val="2E32752F"/>
     <w:multiLevelType w:val="hybridMultilevel"/>
     <w:tmpl w:val="A42A9274"/>
@@ -2287,7 +3321,7 @@
       </w:rPr>
     </w:lvl>
   </w:abstractNum>
-  <w:abstractNum w:abstractNumId="4" w15:restartNumberingAfterBreak="0">
+  <w:abstractNum w:abstractNumId="7" w15:restartNumberingAfterBreak="0">
     <w:nsid w:val="2ED32082"/>
     <w:multiLevelType w:val="multilevel"/>
     <w:tmpl w:val="8044139A"/>
@@ -2427,7 +3461,7 @@
       </w:rPr>
     </w:lvl>
   </w:abstractNum>
-  <w:abstractNum w:abstractNumId="5" w15:restartNumberingAfterBreak="0">
+  <w:abstractNum w:abstractNumId="8" w15:restartNumberingAfterBreak="0">
     <w:nsid w:val="306540C3"/>
     <w:multiLevelType w:val="multilevel"/>
     <w:tmpl w:val="6E02D1F4"/>
@@ -2576,7 +3610,7 @@
       </w:rPr>
     </w:lvl>
   </w:abstractNum>
-  <w:abstractNum w:abstractNumId="6" w15:restartNumberingAfterBreak="0">
+  <w:abstractNum w:abstractNumId="9" w15:restartNumberingAfterBreak="0">
     <w:nsid w:val="37575037"/>
     <w:multiLevelType w:val="multilevel"/>
     <w:tmpl w:val="34308980"/>
@@ -2725,7 +3759,7 @@
       </w:rPr>
     </w:lvl>
   </w:abstractNum>
-  <w:abstractNum w:abstractNumId="7" w15:restartNumberingAfterBreak="0">
+  <w:abstractNum w:abstractNumId="10" w15:restartNumberingAfterBreak="0">
     <w:nsid w:val="432A554F"/>
     <w:multiLevelType w:val="multilevel"/>
     <w:tmpl w:val="10AAA160"/>
@@ -2736,9 +3770,9 @@
       <w:lvlJc w:val="left"/>
       <w:pPr>
         <w:tabs>
-          <w:tab w:val="num" w:pos="720"/>
-        </w:tabs>
-        <w:ind w:left="720" w:hanging="360"/>
+          <w:tab w:val="num" w:pos="360"/>
+        </w:tabs>
+        <w:ind w:left="360" w:hanging="360"/>
       </w:pPr>
       <w:rPr>
         <w:rFonts w:ascii="Symbol" w:hAnsi="Symbol" w:hint="default"/>
@@ -2752,9 +3786,9 @@
       <w:lvlJc w:val="left"/>
       <w:pPr>
         <w:tabs>
-          <w:tab w:val="num" w:pos="1440"/>
-        </w:tabs>
-        <w:ind w:left="1440" w:hanging="360"/>
+          <w:tab w:val="num" w:pos="1080"/>
+        </w:tabs>
+        <w:ind w:left="1080" w:hanging="360"/>
       </w:pPr>
       <w:rPr>
         <w:rFonts w:ascii="Courier New" w:hAnsi="Courier New" w:hint="default"/>
@@ -2768,9 +3802,9 @@
       <w:lvlJc w:val="left"/>
       <w:pPr>
         <w:tabs>
-          <w:tab w:val="num" w:pos="2160"/>
-        </w:tabs>
-        <w:ind w:left="2160" w:hanging="360"/>
+          <w:tab w:val="num" w:pos="1800"/>
+        </w:tabs>
+        <w:ind w:left="1800" w:hanging="360"/>
       </w:pPr>
       <w:rPr>
         <w:rFonts w:ascii="Wingdings" w:hAnsi="Wingdings" w:hint="default"/>
@@ -2784,9 +3818,9 @@
       <w:lvlJc w:val="left"/>
       <w:pPr>
         <w:tabs>
-          <w:tab w:val="num" w:pos="2880"/>
-        </w:tabs>
-        <w:ind w:left="2880" w:hanging="360"/>
+          <w:tab w:val="num" w:pos="2520"/>
+        </w:tabs>
+        <w:ind w:left="2520" w:hanging="360"/>
       </w:pPr>
       <w:rPr>
         <w:rFonts w:ascii="Wingdings" w:hAnsi="Wingdings" w:hint="default"/>
@@ -2800,9 +3834,9 @@
       <w:lvlJc w:val="left"/>
       <w:pPr>
         <w:tabs>
-          <w:tab w:val="num" w:pos="3600"/>
-        </w:tabs>
-        <w:ind w:left="3600" w:hanging="360"/>
+          <w:tab w:val="num" w:pos="3240"/>
+        </w:tabs>
+        <w:ind w:left="3240" w:hanging="360"/>
       </w:pPr>
       <w:rPr>
         <w:rFonts w:ascii="Wingdings" w:hAnsi="Wingdings" w:hint="default"/>
@@ -2816,9 +3850,9 @@
       <w:lvlJc w:val="left"/>
       <w:pPr>
         <w:tabs>
-          <w:tab w:val="num" w:pos="4320"/>
-        </w:tabs>
-        <w:ind w:left="4320" w:hanging="360"/>
+          <w:tab w:val="num" w:pos="3960"/>
+        </w:tabs>
+        <w:ind w:left="3960" w:hanging="360"/>
       </w:pPr>
       <w:rPr>
         <w:rFonts w:ascii="Wingdings" w:hAnsi="Wingdings" w:hint="default"/>
@@ -2832,9 +3866,9 @@
       <w:lvlJc w:val="left"/>
       <w:pPr>
         <w:tabs>
-          <w:tab w:val="num" w:pos="5040"/>
-        </w:tabs>
-        <w:ind w:left="5040" w:hanging="360"/>
+          <w:tab w:val="num" w:pos="4680"/>
+        </w:tabs>
+        <w:ind w:left="4680" w:hanging="360"/>
       </w:pPr>
       <w:rPr>
         <w:rFonts w:ascii="Wingdings" w:hAnsi="Wingdings" w:hint="default"/>
@@ -2848,9 +3882,9 @@
       <w:lvlJc w:val="left"/>
       <w:pPr>
         <w:tabs>
-          <w:tab w:val="num" w:pos="5760"/>
-        </w:tabs>
-        <w:ind w:left="5760" w:hanging="360"/>
+          <w:tab w:val="num" w:pos="5400"/>
+        </w:tabs>
+        <w:ind w:left="5400" w:hanging="360"/>
       </w:pPr>
       <w:rPr>
         <w:rFonts w:ascii="Wingdings" w:hAnsi="Wingdings" w:hint="default"/>
@@ -2864,9 +3898,9 @@
       <w:lvlJc w:val="left"/>
       <w:pPr>
         <w:tabs>
-          <w:tab w:val="num" w:pos="6480"/>
-        </w:tabs>
-        <w:ind w:left="6480" w:hanging="360"/>
+          <w:tab w:val="num" w:pos="6120"/>
+        </w:tabs>
+        <w:ind w:left="6120" w:hanging="360"/>
       </w:pPr>
       <w:rPr>
         <w:rFonts w:ascii="Wingdings" w:hAnsi="Wingdings" w:hint="default"/>
@@ -2874,7 +3908,7 @@
       </w:rPr>
     </w:lvl>
   </w:abstractNum>
-  <w:abstractNum w:abstractNumId="8" w15:restartNumberingAfterBreak="0">
+  <w:abstractNum w:abstractNumId="11" w15:restartNumberingAfterBreak="0">
     <w:nsid w:val="4ED74CC5"/>
     <w:multiLevelType w:val="hybridMultilevel"/>
     <w:tmpl w:val="DEEA641A"/>
@@ -2987,7 +4021,7 @@
       </w:rPr>
     </w:lvl>
   </w:abstractNum>
-  <w:abstractNum w:abstractNumId="9" w15:restartNumberingAfterBreak="0">
+  <w:abstractNum w:abstractNumId="12" w15:restartNumberingAfterBreak="0">
     <w:nsid w:val="5DC10641"/>
     <w:multiLevelType w:val="multilevel"/>
     <w:tmpl w:val="E4425604"/>
@@ -3112,7 +4146,7 @@
       </w:pPr>
     </w:lvl>
   </w:abstractNum>
-  <w:abstractNum w:abstractNumId="10" w15:restartNumberingAfterBreak="0">
+  <w:abstractNum w:abstractNumId="13" w15:restartNumberingAfterBreak="0">
     <w:nsid w:val="5F4B1667"/>
     <w:multiLevelType w:val="multilevel"/>
     <w:tmpl w:val="685ABCDE"/>
@@ -3261,7 +4295,7 @@
       </w:rPr>
     </w:lvl>
   </w:abstractNum>
-  <w:abstractNum w:abstractNumId="11" w15:restartNumberingAfterBreak="0">
+  <w:abstractNum w:abstractNumId="14" w15:restartNumberingAfterBreak="0">
     <w:nsid w:val="609E65AF"/>
     <w:multiLevelType w:val="hybridMultilevel"/>
     <w:tmpl w:val="8D208692"/>
@@ -3374,7 +4408,7 @@
       </w:rPr>
     </w:lvl>
   </w:abstractNum>
-  <w:abstractNum w:abstractNumId="12" w15:restartNumberingAfterBreak="0">
+  <w:abstractNum w:abstractNumId="15" w15:restartNumberingAfterBreak="0">
     <w:nsid w:val="6140161A"/>
     <w:multiLevelType w:val="hybridMultilevel"/>
     <w:tmpl w:val="1746283E"/>
@@ -3487,7 +4521,7 @@
       </w:rPr>
     </w:lvl>
   </w:abstractNum>
-  <w:abstractNum w:abstractNumId="13" w15:restartNumberingAfterBreak="0">
+  <w:abstractNum w:abstractNumId="16" w15:restartNumberingAfterBreak="0">
     <w:nsid w:val="61EA190B"/>
     <w:multiLevelType w:val="multilevel"/>
     <w:tmpl w:val="EAF0B184"/>
@@ -3609,7 +4643,7 @@
       </w:pPr>
     </w:lvl>
   </w:abstractNum>
-  <w:abstractNum w:abstractNumId="14" w15:restartNumberingAfterBreak="0">
+  <w:abstractNum w:abstractNumId="17" w15:restartNumberingAfterBreak="0">
     <w:nsid w:val="693025A3"/>
     <w:multiLevelType w:val="multilevel"/>
     <w:tmpl w:val="2758D522"/>
@@ -3758,7 +4792,120 @@
       </w:rPr>
     </w:lvl>
   </w:abstractNum>
-  <w:abstractNum w:abstractNumId="15" w15:restartNumberingAfterBreak="0">
+  <w:abstractNum w:abstractNumId="18" w15:restartNumberingAfterBreak="0">
+    <w:nsid w:val="6C77556D"/>
+    <w:multiLevelType w:val="hybridMultilevel"/>
+    <w:tmpl w:val="23363A8C"/>
+    <w:lvl w:ilvl="0" w:tplc="08090001">
+      <w:start w:val="1"/>
+      <w:numFmt w:val="bullet"/>
+      <w:lvlText w:val=""/>
+      <w:lvlJc w:val="left"/>
+      <w:pPr>
+        <w:ind w:left="720" w:hanging="360"/>
+      </w:pPr>
+      <w:rPr>
+        <w:rFonts w:ascii="Symbol" w:hAnsi="Symbol" w:hint="default"/>
+      </w:rPr>
+    </w:lvl>
+    <w:lvl w:ilvl="1" w:tplc="08090003" w:tentative="1">
+      <w:start w:val="1"/>
+      <w:numFmt w:val="bullet"/>
+      <w:lvlText w:val="o"/>
+      <w:lvlJc w:val="left"/>
+      <w:pPr>
+        <w:ind w:left="1440" w:hanging="360"/>
+      </w:pPr>
+      <w:rPr>
+        <w:rFonts w:ascii="Courier New" w:hAnsi="Courier New" w:cs="Courier New" w:hint="default"/>
+      </w:rPr>
+    </w:lvl>
+    <w:lvl w:ilvl="2" w:tplc="08090005" w:tentative="1">
+      <w:start w:val="1"/>
+      <w:numFmt w:val="bullet"/>
+      <w:lvlText w:val=""/>
+      <w:lvlJc w:val="left"/>
+      <w:pPr>
+        <w:ind w:left="2160" w:hanging="360"/>
+      </w:pPr>
+      <w:rPr>
+        <w:rFonts w:ascii="Wingdings" w:hAnsi="Wingdings" w:hint="default"/>
+      </w:rPr>
+    </w:lvl>
+    <w:lvl w:ilvl="3" w:tplc="08090001" w:tentative="1">
+      <w:start w:val="1"/>
+      <w:numFmt w:val="bullet"/>
+      <w:lvlText w:val=""/>
+      <w:lvlJc w:val="left"/>
+      <w:pPr>
+        <w:ind w:left="2880" w:hanging="360"/>
+      </w:pPr>
+      <w:rPr>
+        <w:rFonts w:ascii="Symbol" w:hAnsi="Symbol" w:hint="default"/>
+      </w:rPr>
+    </w:lvl>
+    <w:lvl w:ilvl="4" w:tplc="08090003" w:tentative="1">
+      <w:start w:val="1"/>
+      <w:numFmt w:val="bullet"/>
+      <w:lvlText w:val="o"/>
+      <w:lvlJc w:val="left"/>
+      <w:pPr>
+        <w:ind w:left="3600" w:hanging="360"/>
+      </w:pPr>
+      <w:rPr>
+        <w:rFonts w:ascii="Courier New" w:hAnsi="Courier New" w:cs="Courier New" w:hint="default"/>
+      </w:rPr>
+    </w:lvl>
+    <w:lvl w:ilvl="5" w:tplc="08090005" w:tentative="1">
+      <w:start w:val="1"/>
+      <w:numFmt w:val="bullet"/>
+      <w:lvlText w:val=""/>
+      <w:lvlJc w:val="left"/>
+      <w:pPr>
+        <w:ind w:left="4320" w:hanging="360"/>
+      </w:pPr>
+      <w:rPr>
+        <w:rFonts w:ascii="Wingdings" w:hAnsi="Wingdings" w:hint="default"/>
+      </w:rPr>
+    </w:lvl>
+    <w:lvl w:ilvl="6" w:tplc="08090001" w:tentative="1">
+      <w:start w:val="1"/>
+      <w:numFmt w:val="bullet"/>
+      <w:lvlText w:val=""/>
+      <w:lvlJc w:val="left"/>
+      <w:pPr>
+        <w:ind w:left="5040" w:hanging="360"/>
+      </w:pPr>
+      <w:rPr>
+        <w:rFonts w:ascii="Symbol" w:hAnsi="Symbol" w:hint="default"/>
+      </w:rPr>
+    </w:lvl>
+    <w:lvl w:ilvl="7" w:tplc="08090003" w:tentative="1">
+      <w:start w:val="1"/>
+      <w:numFmt w:val="bullet"/>
+      <w:lvlText w:val="o"/>
+      <w:lvlJc w:val="left"/>
+      <w:pPr>
+        <w:ind w:left="5760" w:hanging="360"/>
+      </w:pPr>
+      <w:rPr>
+        <w:rFonts w:ascii="Courier New" w:hAnsi="Courier New" w:cs="Courier New" w:hint="default"/>
+      </w:rPr>
+    </w:lvl>
+    <w:lvl w:ilvl="8" w:tplc="08090005" w:tentative="1">
+      <w:start w:val="1"/>
+      <w:numFmt w:val="bullet"/>
+      <w:lvlText w:val=""/>
+      <w:lvlJc w:val="left"/>
+      <w:pPr>
+        <w:ind w:left="6480" w:hanging="360"/>
+      </w:pPr>
+      <w:rPr>
+        <w:rFonts w:ascii="Wingdings" w:hAnsi="Wingdings" w:hint="default"/>
+      </w:rPr>
+    </w:lvl>
+  </w:abstractNum>
+  <w:abstractNum w:abstractNumId="19" w15:restartNumberingAfterBreak="0">
     <w:nsid w:val="79B6136C"/>
     <w:multiLevelType w:val="multilevel"/>
     <w:tmpl w:val="B34A8AD0"/>
@@ -3899,52 +5046,64 @@
     </w:lvl>
   </w:abstractNum>
   <w:num w:numId="1" w16cid:durableId="100731460">
-    <w:abstractNumId w:val="9"/>
+    <w:abstractNumId w:val="12"/>
   </w:num>
   <w:num w:numId="2" w16cid:durableId="1883131058">
     <w:abstractNumId w:val="0"/>
   </w:num>
   <w:num w:numId="3" w16cid:durableId="2094161260">
+    <w:abstractNumId w:val="7"/>
+  </w:num>
+  <w:num w:numId="4" w16cid:durableId="1440832814">
+    <w:abstractNumId w:val="2"/>
+  </w:num>
+  <w:num w:numId="5" w16cid:durableId="1379089436">
+    <w:abstractNumId w:val="19"/>
+  </w:num>
+  <w:num w:numId="6" w16cid:durableId="889611998">
     <w:abstractNumId w:val="4"/>
   </w:num>
-  <w:num w:numId="4" w16cid:durableId="1440832814">
+  <w:num w:numId="7" w16cid:durableId="1341397362">
+    <w:abstractNumId w:val="16"/>
+  </w:num>
+  <w:num w:numId="8" w16cid:durableId="2107841846">
+    <w:abstractNumId w:val="11"/>
+  </w:num>
+  <w:num w:numId="9" w16cid:durableId="1793553634">
+    <w:abstractNumId w:val="14"/>
+  </w:num>
+  <w:num w:numId="10" w16cid:durableId="1386173184">
+    <w:abstractNumId w:val="15"/>
+  </w:num>
+  <w:num w:numId="11" w16cid:durableId="1991397595">
+    <w:abstractNumId w:val="6"/>
+  </w:num>
+  <w:num w:numId="12" w16cid:durableId="730465238">
+    <w:abstractNumId w:val="9"/>
+  </w:num>
+  <w:num w:numId="13" w16cid:durableId="275717700">
+    <w:abstractNumId w:val="17"/>
+  </w:num>
+  <w:num w:numId="14" w16cid:durableId="670916958">
+    <w:abstractNumId w:val="10"/>
+  </w:num>
+  <w:num w:numId="15" w16cid:durableId="171772109">
+    <w:abstractNumId w:val="8"/>
+  </w:num>
+  <w:num w:numId="16" w16cid:durableId="60295530">
+    <w:abstractNumId w:val="13"/>
+  </w:num>
+  <w:num w:numId="17" w16cid:durableId="2112048917">
     <w:abstractNumId w:val="1"/>
   </w:num>
-  <w:num w:numId="5" w16cid:durableId="1379089436">
-    <w:abstractNumId w:val="15"/>
-  </w:num>
-  <w:num w:numId="6" w16cid:durableId="889611998">
-    <w:abstractNumId w:val="2"/>
-  </w:num>
-  <w:num w:numId="7" w16cid:durableId="1341397362">
-    <w:abstractNumId w:val="13"/>
-  </w:num>
-  <w:num w:numId="8" w16cid:durableId="2107841846">
-    <w:abstractNumId w:val="8"/>
-  </w:num>
-  <w:num w:numId="9" w16cid:durableId="1793553634">
-    <w:abstractNumId w:val="11"/>
-  </w:num>
-  <w:num w:numId="10" w16cid:durableId="1386173184">
-    <w:abstractNumId w:val="12"/>
-  </w:num>
-  <w:num w:numId="11" w16cid:durableId="1991397595">
+  <w:num w:numId="18" w16cid:durableId="261305203">
     <w:abstractNumId w:val="3"/>
   </w:num>
-  <w:num w:numId="12" w16cid:durableId="730465238">
-    <w:abstractNumId w:val="6"/>
-  </w:num>
-  <w:num w:numId="13" w16cid:durableId="275717700">
-    <w:abstractNumId w:val="14"/>
-  </w:num>
-  <w:num w:numId="14" w16cid:durableId="670916958">
-    <w:abstractNumId w:val="7"/>
-  </w:num>
-  <w:num w:numId="15" w16cid:durableId="171772109">
+  <w:num w:numId="19" w16cid:durableId="1670252545">
     <w:abstractNumId w:val="5"/>
   </w:num>
-  <w:num w:numId="16" w16cid:durableId="60295530">
-    <w:abstractNumId w:val="10"/>
+  <w:num w:numId="20" w16cid:durableId="1116674925">
+    <w:abstractNumId w:val="18"/>
   </w:num>
 </w:numbering>
 </file>
@@ -4348,7 +5507,7 @@
   <w:style w:type="paragraph" w:default="1" w:styleId="Normal">
     <w:name w:val="Normal"/>
     <w:qFormat/>
-    <w:rsid w:val="00572B76"/>
+    <w:rsid w:val="008A27D9"/>
     <w:pPr>
       <w:spacing w:after="120"/>
       <w:jc w:val="both"/>
@@ -4430,7 +5589,6 @@
   <w:style w:type="character" w:default="1" w:styleId="DefaultParagraphFont">
     <w:name w:val="Default Paragraph Font"/>
     <w:uiPriority w:val="1"/>
-    <w:semiHidden/>
     <w:unhideWhenUsed/>
   </w:style>
   <w:style w:type="table" w:default="1" w:styleId="TableNormal">
@@ -4739,6 +5897,7 @@
   <w:style w:type="paragraph" w:styleId="ListParagraph">
     <w:name w:val="List Paragraph"/>
     <w:basedOn w:val="Normal"/>
+    <w:link w:val="ListParagraphChar"/>
     <w:uiPriority w:val="34"/>
     <w:qFormat/>
     <w:rsid w:val="00572B76"/>
@@ -4900,7 +6059,6 @@
     <w:name w:val="Normal (Web)"/>
     <w:basedOn w:val="Normal"/>
     <w:uiPriority w:val="99"/>
-    <w:semiHidden/>
     <w:unhideWhenUsed/>
     <w:rsid w:val="00EB3C3E"/>
     <w:pPr>
@@ -4914,6 +6072,42 @@
       <w:sz w:val="24"/>
       <w:szCs w:val="24"/>
       <w:lang w:eastAsia="en-GB" w:bidi="ar-SA"/>
+    </w:rPr>
+  </w:style>
+  <w:style w:type="paragraph" w:customStyle="1" w:styleId="BasicParagraph">
+    <w:name w:val="[Basic Paragraph]"/>
+    <w:basedOn w:val="Normal"/>
+    <w:uiPriority w:val="99"/>
+    <w:rsid w:val="00BC6EFF"/>
+    <w:pPr>
+      <w:suppressAutoHyphens w:val="0"/>
+      <w:autoSpaceDE w:val="0"/>
+      <w:autoSpaceDN w:val="0"/>
+      <w:adjustRightInd w:val="0"/>
+      <w:spacing w:after="0" w:line="288" w:lineRule="auto"/>
+      <w:jc w:val="left"/>
+      <w:textAlignment w:val="center"/>
+    </w:pPr>
+    <w:rPr>
+      <w:rFonts w:ascii="MinionPro-Regular" w:eastAsiaTheme="minorHAnsi" w:hAnsi="MinionPro-Regular" w:cs="MinionPro-Regular"/>
+      <w:color w:val="000000"/>
+      <w:kern w:val="0"/>
+      <w:sz w:val="24"/>
+      <w:szCs w:val="24"/>
+      <w:lang w:eastAsia="en-US" w:bidi="ar-SA"/>
+    </w:rPr>
+  </w:style>
+  <w:style w:type="character" w:customStyle="1" w:styleId="ListParagraphChar">
+    <w:name w:val="List Paragraph Char"/>
+    <w:basedOn w:val="DefaultParagraphFont"/>
+    <w:link w:val="ListParagraph"/>
+    <w:uiPriority w:val="34"/>
+    <w:rsid w:val="008A27D9"/>
+    <w:rPr>
+      <w:rFonts w:ascii="Helvetica" w:hAnsi="Helvetica" w:cs="Mangal"/>
+      <w:sz w:val="22"/>
+      <w:szCs w:val="28"/>
+      <w:lang w:val="en-GB"/>
     </w:rPr>
   </w:style>
 </w:styles>

</xml_diff>